<commit_message>
Remove gs4_auth() from setup
</commit_message>
<xml_diff>
--- a/Author-List.docx
+++ b/Author-List.docx
@@ -108,11 +108,322 @@
         <w:rPr>
           <w:vertAlign w:val="superscript"/>
         </w:rPr>
+        <w:t xml:space="preserve">5</w:t>
+      </w:r>
+      <w:r>
+        <w:t xml:space="preserve">, Tori V. Burt</w:t>
+      </w:r>
+      <w:r>
+        <w:rPr>
+          <w:vertAlign w:val="superscript"/>
+        </w:rPr>
         <w:t xml:space="preserve">6</w:t>
       </w:r>
       <w:r>
-        <w:t xml:space="preserve">, Tori V. Burt</w:t>
-      </w:r>
+        <w:t xml:space="preserve">, Sydney Collins</w:t>
+      </w:r>
+      <w:r>
+        <w:rPr>
+          <w:vertAlign w:val="superscript"/>
+        </w:rPr>
+        <w:t xml:space="preserve">6</w:t>
+      </w:r>
+      <w:r>
+        <w:t xml:space="preserve">, Steven Duffy</w:t>
+      </w:r>
+      <w:r>
+        <w:rPr>
+          <w:vertAlign w:val="superscript"/>
+        </w:rPr>
+        <w:t xml:space="preserve">3,7</w:t>
+      </w:r>
+      <w:r>
+        <w:t xml:space="preserve">, Jolene A. Giacinti</w:t>
+      </w:r>
+      <w:r>
+        <w:rPr>
+          <w:vertAlign w:val="superscript"/>
+        </w:rPr>
+        <w:t xml:space="preserve">1</w:t>
+      </w:r>
+      <w:r>
+        <w:t xml:space="preserve">, Scott Gilliland</w:t>
+      </w:r>
+      <w:r>
+        <w:rPr>
+          <w:vertAlign w:val="superscript"/>
+        </w:rPr>
+        <w:t xml:space="preserve">5</w:t>
+      </w:r>
+      <w:r>
+        <w:t xml:space="preserve">, Jean-François Giroux</w:t>
+      </w:r>
+      <w:r>
+        <w:rPr>
+          <w:vertAlign w:val="superscript"/>
+        </w:rPr>
+        <w:t xml:space="preserve">8,9</w:t>
+      </w:r>
+      <w:r>
+        <w:t xml:space="preserve">, Carina Gjerdrum</w:t>
+      </w:r>
+      <w:r>
+        <w:rPr>
+          <w:vertAlign w:val="superscript"/>
+        </w:rPr>
+        <w:t xml:space="preserve">2</w:t>
+      </w:r>
+      <w:r>
+        <w:t xml:space="preserve">, Magella Guillemette</w:t>
+      </w:r>
+      <w:r>
+        <w:rPr>
+          <w:vertAlign w:val="superscript"/>
+        </w:rPr>
+        <w:t xml:space="preserve">10</w:t>
+      </w:r>
+      <w:r>
+        <w:t xml:space="preserve">, Kathryn E. Hargan</w:t>
+      </w:r>
+      <w:r>
+        <w:rPr>
+          <w:vertAlign w:val="superscript"/>
+        </w:rPr>
+        <w:t xml:space="preserve">11</w:t>
+      </w:r>
+      <w:r>
+        <w:t xml:space="preserve">, Megan Jones</w:t>
+      </w:r>
+      <w:r>
+        <w:rPr>
+          <w:vertAlign w:val="superscript"/>
+        </w:rPr>
+        <w:t xml:space="preserve">12,13</w:t>
+      </w:r>
+      <w:r>
+        <w:t xml:space="preserve">, Andrew Kennedy</w:t>
+      </w:r>
+      <w:r>
+        <w:rPr>
+          <w:vertAlign w:val="superscript"/>
+        </w:rPr>
+        <w:t xml:space="preserve">5</w:t>
+      </w:r>
+      <w:r>
+        <w:t xml:space="preserve">, Stéphane Lair</w:t>
+      </w:r>
+      <w:r>
+        <w:rPr>
+          <w:vertAlign w:val="superscript"/>
+        </w:rPr>
+        <w:t xml:space="preserve">14</w:t>
+      </w:r>
+      <w:r>
+        <w:t xml:space="preserve">, Andrew Lang</w:t>
+      </w:r>
+      <w:r>
+        <w:rPr>
+          <w:vertAlign w:val="superscript"/>
+        </w:rPr>
+        <w:t xml:space="preserve">11</w:t>
+      </w:r>
+      <w:r>
+        <w:t xml:space="preserve">, Christine Lepage</w:t>
+      </w:r>
+      <w:r>
+        <w:rPr>
+          <w:vertAlign w:val="superscript"/>
+        </w:rPr>
+        <w:t xml:space="preserve">4</w:t>
+      </w:r>
+      <w:r>
+        <w:t xml:space="preserve">, Gretchen McPhail</w:t>
+      </w:r>
+      <w:r>
+        <w:rPr>
+          <w:vertAlign w:val="superscript"/>
+        </w:rPr>
+        <w:t xml:space="preserve">6</w:t>
+      </w:r>
+      <w:r>
+        <w:t xml:space="preserve">, William A. Montevecchi</w:t>
+      </w:r>
+      <w:r>
+        <w:rPr>
+          <w:vertAlign w:val="superscript"/>
+        </w:rPr>
+        <w:t xml:space="preserve">6</w:t>
+      </w:r>
+      <w:r>
+        <w:t xml:space="preserve">, Glen J. Parsons</w:t>
+      </w:r>
+      <w:r>
+        <w:rPr>
+          <w:vertAlign w:val="superscript"/>
+        </w:rPr>
+        <w:t xml:space="preserve">15</w:t>
+      </w:r>
+      <w:r>
+        <w:t xml:space="preserve">, Jennifer P. Provencher</w:t>
+      </w:r>
+      <w:r>
+        <w:rPr>
+          <w:vertAlign w:val="superscript"/>
+        </w:rPr>
+        <w:t xml:space="preserve">1</w:t>
+      </w:r>
+      <w:r>
+        <w:t xml:space="preserve">, Ishraq Rahman</w:t>
+      </w:r>
+      <w:r>
+        <w:rPr>
+          <w:vertAlign w:val="superscript"/>
+        </w:rPr>
+        <w:t xml:space="preserve">11</w:t>
+      </w:r>
+      <w:r>
+        <w:t xml:space="preserve">, Gregory J. Robertson</w:t>
+      </w:r>
+      <w:r>
+        <w:rPr>
+          <w:vertAlign w:val="superscript"/>
+        </w:rPr>
+        <w:t xml:space="preserve">16</w:t>
+      </w:r>
+      <w:r>
+        <w:t xml:space="preserve">, Yannick Seyer</w:t>
+      </w:r>
+      <w:r>
+        <w:rPr>
+          <w:vertAlign w:val="superscript"/>
+        </w:rPr>
+        <w:t xml:space="preserve">4,17</w:t>
+      </w:r>
+      <w:r>
+        <w:t xml:space="preserve">, Catherine Soos</w:t>
+      </w:r>
+      <w:r>
+        <w:rPr>
+          <w:vertAlign w:val="superscript"/>
+        </w:rPr>
+        <w:t xml:space="preserve">18</w:t>
+      </w:r>
+      <w:r>
+        <w:t xml:space="preserve">, Christopher R. E. Ward</w:t>
+      </w:r>
+      <w:r>
+        <w:rPr>
+          <w:vertAlign w:val="superscript"/>
+        </w:rPr>
+        <w:t xml:space="preserve">3</w:t>
+      </w:r>
+      <w:r>
+        <w:t xml:space="preserve">, Regina Wells</w:t>
+      </w:r>
+      <w:r>
+        <w:rPr>
+          <w:vertAlign w:val="superscript"/>
+        </w:rPr>
+        <w:t xml:space="preserve">19</w:t>
+      </w:r>
+      <w:r>
+        <w:t xml:space="preserve">, Jordan Wight</w:t>
+      </w:r>
+      <w:r>
+        <w:rPr>
+          <w:vertAlign w:val="superscript"/>
+        </w:rPr>
+        <w:t xml:space="preserve">11</w:t>
+      </w:r>
+    </w:p>
+    <w:p>
+      <w:pPr>
+        <w:pStyle w:val="BodyText"/>
+      </w:pPr>
+      <w:r>
+        <w:rPr>
+          <w:vertAlign w:val="superscript"/>
+        </w:rPr>
+        <w:t xml:space="preserve">1</w:t>
+      </w:r>
+      <w:r>
+        <w:t xml:space="preserve">Environment and Climate Change Canada, Wildlife and Landscape Science Directorate, Ottawa, Ontario, Canada</w:t>
+      </w:r>
+    </w:p>
+    <w:p>
+      <w:pPr>
+        <w:pStyle w:val="BodyText"/>
+      </w:pPr>
+      <w:r>
+        <w:rPr>
+          <w:vertAlign w:val="superscript"/>
+        </w:rPr>
+        <w:t xml:space="preserve">2</w:t>
+      </w:r>
+      <w:r>
+        <w:t xml:space="preserve">Environment and Climate Change Canada, Canadian Wildlife Service, Dartmouth, Nova Scotia, Canada</w:t>
+      </w:r>
+    </w:p>
+    <w:p>
+      <w:pPr>
+        <w:pStyle w:val="BodyText"/>
+      </w:pPr>
+      <w:r>
+        <w:rPr>
+          <w:vertAlign w:val="superscript"/>
+        </w:rPr>
+        <w:t xml:space="preserve">3</w:t>
+      </w:r>
+      <w:r>
+        <w:t xml:space="preserve">Environment and Climate Change Canada, Canadian Wildlife Service, Mount Pearl, Newfoundland and Labrador, Canada</w:t>
+      </w:r>
+    </w:p>
+    <w:p>
+      <w:pPr>
+        <w:pStyle w:val="BodyText"/>
+      </w:pPr>
+      <w:r>
+        <w:rPr>
+          <w:vertAlign w:val="superscript"/>
+        </w:rPr>
+        <w:t xml:space="preserve">4</w:t>
+      </w:r>
+      <w:r>
+        <w:t xml:space="preserve">Environment and Climate Change Canada, Canadian Wildlife Service, Québec, Québec, Canada</w:t>
+      </w:r>
+    </w:p>
+    <w:p>
+      <w:pPr>
+        <w:pStyle w:val="BodyText"/>
+      </w:pPr>
+      <w:r>
+        <w:rPr>
+          <w:vertAlign w:val="superscript"/>
+        </w:rPr>
+        <w:t xml:space="preserve">5</w:t>
+      </w:r>
+      <w:r>
+        <w:t xml:space="preserve">Environment and Climate Change Canada, Canadian Wildlife Service, Sackville, New Brunswick, Canada</w:t>
+      </w:r>
+    </w:p>
+    <w:p>
+      <w:pPr>
+        <w:pStyle w:val="BodyText"/>
+      </w:pPr>
+      <w:r>
+        <w:rPr>
+          <w:vertAlign w:val="superscript"/>
+        </w:rPr>
+        <w:t xml:space="preserve">6</w:t>
+      </w:r>
+      <w:r>
+        <w:t xml:space="preserve">Memorial University of Newfoundland, Department of Psychology, St. John’s, Newfoundland and Labrador, Canada</w:t>
+      </w:r>
+    </w:p>
+    <w:p>
+      <w:pPr>
+        <w:pStyle w:val="BodyText"/>
+      </w:pPr>
       <w:r>
         <w:rPr>
           <w:vertAlign w:val="superscript"/>
@@ -120,17 +431,13 @@
         <w:t xml:space="preserve">7</w:t>
       </w:r>
       <w:r>
-        <w:t xml:space="preserve">, Sydney Collins</w:t>
-      </w:r>
-      <w:r>
-        <w:rPr>
-          <w:vertAlign w:val="superscript"/>
-        </w:rPr>
-        <w:t xml:space="preserve">7</w:t>
-      </w:r>
-      <w:r>
-        <w:t xml:space="preserve">, Steven Duffy</w:t>
-      </w:r>
+        <w:t xml:space="preserve">Fisheries and Oceans Canada, Mount Pearl, Newfoundland and Labrador, Canada</w:t>
+      </w:r>
+    </w:p>
+    <w:p>
+      <w:pPr>
+        <w:pStyle w:val="BodyText"/>
+      </w:pPr>
       <w:r>
         <w:rPr>
           <w:vertAlign w:val="superscript"/>
@@ -138,8 +445,13 @@
         <w:t xml:space="preserve">8</w:t>
       </w:r>
       <w:r>
-        <w:t xml:space="preserve">, Jolene A. Giacinti</w:t>
-      </w:r>
+        <w:t xml:space="preserve">Département des Sciences Biologiques, Université du Québec à Montréal, Montréal, Québec, Canada</w:t>
+      </w:r>
+    </w:p>
+    <w:p>
+      <w:pPr>
+        <w:pStyle w:val="BodyText"/>
+      </w:pPr>
       <w:r>
         <w:rPr>
           <w:vertAlign w:val="superscript"/>
@@ -147,8 +459,13 @@
         <w:t xml:space="preserve">9</w:t>
       </w:r>
       <w:r>
-        <w:t xml:space="preserve">, Scott Gilliland</w:t>
-      </w:r>
+        <w:t xml:space="preserve">Société Duvetnor Ltée, Montréal, Québec, Canada</w:t>
+      </w:r>
+    </w:p>
+    <w:p>
+      <w:pPr>
+        <w:pStyle w:val="BodyText"/>
+      </w:pPr>
       <w:r>
         <w:rPr>
           <w:vertAlign w:val="superscript"/>
@@ -156,17 +473,41 @@
         <w:t xml:space="preserve">10</w:t>
       </w:r>
       <w:r>
-        <w:t xml:space="preserve">, Jean-François Giroux</w:t>
-      </w:r>
-      <w:r>
-        <w:rPr>
-          <w:vertAlign w:val="superscript"/>
-        </w:rPr>
-        <w:t xml:space="preserve">11,12</w:t>
-      </w:r>
-      <w:r>
-        <w:t xml:space="preserve">, Carina Gjerdrum</w:t>
-      </w:r>
+        <w:t xml:space="preserve">Université du Québec à Rimouski, Department of Biology, Chemistry and Geography, Rimouski, Québec, Canada</w:t>
+      </w:r>
+    </w:p>
+    <w:p>
+      <w:pPr>
+        <w:pStyle w:val="BodyText"/>
+      </w:pPr>
+      <w:r>
+        <w:rPr>
+          <w:vertAlign w:val="superscript"/>
+        </w:rPr>
+        <w:t xml:space="preserve">11</w:t>
+      </w:r>
+      <w:r>
+        <w:t xml:space="preserve">Memorial University of Newfoundland, Department of Biology, St. John’s, Newfoundland and Labrador, Canada</w:t>
+      </w:r>
+    </w:p>
+    <w:p>
+      <w:pPr>
+        <w:pStyle w:val="BodyText"/>
+      </w:pPr>
+      <w:r>
+        <w:rPr>
+          <w:vertAlign w:val="superscript"/>
+        </w:rPr>
+        <w:t xml:space="preserve">12</w:t>
+      </w:r>
+      <w:r>
+        <w:t xml:space="preserve">University of Prince Edward Island, Department of Pathology and Microbiology, Charlottetown, Prince Edward Island, Canada</w:t>
+      </w:r>
+    </w:p>
+    <w:p>
+      <w:pPr>
+        <w:pStyle w:val="BodyText"/>
+      </w:pPr>
       <w:r>
         <w:rPr>
           <w:vertAlign w:val="superscript"/>
@@ -174,8 +515,13 @@
         <w:t xml:space="preserve">13</w:t>
       </w:r>
       <w:r>
-        <w:t xml:space="preserve">, Magella Guillemette</w:t>
-      </w:r>
+        <w:t xml:space="preserve">Canadian Wildlife Health Cooperative, Charlottetown, Prince Edward Island, Canada</w:t>
+      </w:r>
+    </w:p>
+    <w:p>
+      <w:pPr>
+        <w:pStyle w:val="BodyText"/>
+      </w:pPr>
       <w:r>
         <w:rPr>
           <w:vertAlign w:val="superscript"/>
@@ -183,8 +529,13 @@
         <w:t xml:space="preserve">14</w:t>
       </w:r>
       <w:r>
-        <w:t xml:space="preserve">, Kathryn E. Hargan</w:t>
-      </w:r>
+        <w:t xml:space="preserve">Université de Montréal, Faculté de médecine vétérinaire, Canadian Wildlife Health Cooperative, Centre québécois sur la santé des animaux sauvages, Montréal, Québec, Canada</w:t>
+      </w:r>
+    </w:p>
+    <w:p>
+      <w:pPr>
+        <w:pStyle w:val="BodyText"/>
+      </w:pPr>
       <w:r>
         <w:rPr>
           <w:vertAlign w:val="superscript"/>
@@ -192,17 +543,41 @@
         <w:t xml:space="preserve">15</w:t>
       </w:r>
       <w:r>
-        <w:t xml:space="preserve">, Megan Jones</w:t>
-      </w:r>
-      <w:r>
-        <w:rPr>
-          <w:vertAlign w:val="superscript"/>
-        </w:rPr>
-        <w:t xml:space="preserve">16,17</w:t>
-      </w:r>
-      <w:r>
-        <w:t xml:space="preserve">, Andrew Kennedy</w:t>
-      </w:r>
+        <w:t xml:space="preserve">Department of Natural Resources and Renewables, Halifax, Nova Scotia, Canada</w:t>
+      </w:r>
+    </w:p>
+    <w:p>
+      <w:pPr>
+        <w:pStyle w:val="BodyText"/>
+      </w:pPr>
+      <w:r>
+        <w:rPr>
+          <w:vertAlign w:val="superscript"/>
+        </w:rPr>
+        <w:t xml:space="preserve">16</w:t>
+      </w:r>
+      <w:r>
+        <w:t xml:space="preserve">Environment and Climate Change Canada, Wildlife and Landscape Science Directorate, Mount Pearl, Newfoundland and Labrador, Canada</w:t>
+      </w:r>
+    </w:p>
+    <w:p>
+      <w:pPr>
+        <w:pStyle w:val="BodyText"/>
+      </w:pPr>
+      <w:r>
+        <w:rPr>
+          <w:vertAlign w:val="superscript"/>
+        </w:rPr>
+        <w:t xml:space="preserve">17</w:t>
+      </w:r>
+      <w:r>
+        <w:t xml:space="preserve">Université du Québec à Rimouski, Department of Biology, Chemistry and Geography, Québec, Québec, Canada</w:t>
+      </w:r>
+    </w:p>
+    <w:p>
+      <w:pPr>
+        <w:pStyle w:val="BodyText"/>
+      </w:pPr>
       <w:r>
         <w:rPr>
           <w:vertAlign w:val="superscript"/>
@@ -210,463 +585,18 @@
         <w:t xml:space="preserve">18</w:t>
       </w:r>
       <w:r>
-        <w:t xml:space="preserve">, Stéphane Lair</w:t>
-      </w:r>
+        <w:t xml:space="preserve">Environment and Climate Change Canada, Wildlife and Landscape Science Directorate, Saskatoon, Saskatchewan, Canada</w:t>
+      </w:r>
+    </w:p>
+    <w:p>
+      <w:pPr>
+        <w:pStyle w:val="BodyText"/>
+      </w:pPr>
       <w:r>
         <w:rPr>
           <w:vertAlign w:val="superscript"/>
         </w:rPr>
         <w:t xml:space="preserve">19</w:t>
-      </w:r>
-      <w:r>
-        <w:t xml:space="preserve">, Andrew Lang</w:t>
-      </w:r>
-      <w:r>
-        <w:rPr>
-          <w:vertAlign w:val="superscript"/>
-        </w:rPr>
-        <w:t xml:space="preserve">15</w:t>
-      </w:r>
-      <w:r>
-        <w:t xml:space="preserve">, Christine Lepage</w:t>
-      </w:r>
-      <w:r>
-        <w:rPr>
-          <w:vertAlign w:val="superscript"/>
-        </w:rPr>
-        <w:t xml:space="preserve">4</w:t>
-      </w:r>
-      <w:r>
-        <w:t xml:space="preserve">, Gretchen McPhail</w:t>
-      </w:r>
-      <w:r>
-        <w:rPr>
-          <w:vertAlign w:val="superscript"/>
-        </w:rPr>
-        <w:t xml:space="preserve">7</w:t>
-      </w:r>
-      <w:r>
-        <w:t xml:space="preserve">, William A. Montevecchi</w:t>
-      </w:r>
-      <w:r>
-        <w:rPr>
-          <w:vertAlign w:val="superscript"/>
-        </w:rPr>
-        <w:t xml:space="preserve">7</w:t>
-      </w:r>
-      <w:r>
-        <w:t xml:space="preserve">, Glen J. Parsons</w:t>
-      </w:r>
-      <w:r>
-        <w:rPr>
-          <w:vertAlign w:val="superscript"/>
-        </w:rPr>
-        <w:t xml:space="preserve">20</w:t>
-      </w:r>
-      <w:r>
-        <w:t xml:space="preserve">, Jennifer P. Provencher</w:t>
-      </w:r>
-      <w:r>
-        <w:rPr>
-          <w:vertAlign w:val="superscript"/>
-        </w:rPr>
-        <w:t xml:space="preserve">1</w:t>
-      </w:r>
-      <w:r>
-        <w:t xml:space="preserve">, Ishraq Rahman</w:t>
-      </w:r>
-      <w:r>
-        <w:rPr>
-          <w:vertAlign w:val="superscript"/>
-        </w:rPr>
-        <w:t xml:space="preserve">15</w:t>
-      </w:r>
-      <w:r>
-        <w:t xml:space="preserve">, Gregory J. Robertson</w:t>
-      </w:r>
-      <w:r>
-        <w:rPr>
-          <w:vertAlign w:val="superscript"/>
-        </w:rPr>
-        <w:t xml:space="preserve">21</w:t>
-      </w:r>
-      <w:r>
-        <w:t xml:space="preserve">, Yannick Seyer</w:t>
-      </w:r>
-      <w:r>
-        <w:rPr>
-          <w:vertAlign w:val="superscript"/>
-        </w:rPr>
-        <w:t xml:space="preserve">4,22</w:t>
-      </w:r>
-      <w:r>
-        <w:t xml:space="preserve">, Catherine Soos</w:t>
-      </w:r>
-      <w:r>
-        <w:rPr>
-          <w:vertAlign w:val="superscript"/>
-        </w:rPr>
-        <w:t xml:space="preserve">23</w:t>
-      </w:r>
-      <w:r>
-        <w:t xml:space="preserve">, Christopher R. E. Ward</w:t>
-      </w:r>
-      <w:r>
-        <w:rPr>
-          <w:vertAlign w:val="superscript"/>
-        </w:rPr>
-        <w:t xml:space="preserve">3</w:t>
-      </w:r>
-      <w:r>
-        <w:t xml:space="preserve">, Regina Wells</w:t>
-      </w:r>
-      <w:r>
-        <w:rPr>
-          <w:vertAlign w:val="superscript"/>
-        </w:rPr>
-        <w:t xml:space="preserve">24</w:t>
-      </w:r>
-      <w:r>
-        <w:t xml:space="preserve">, Jordan Wight</w:t>
-      </w:r>
-      <w:r>
-        <w:rPr>
-          <w:vertAlign w:val="superscript"/>
-        </w:rPr>
-        <w:t xml:space="preserve">15</w:t>
-      </w:r>
-    </w:p>
-    <w:p>
-      <w:pPr>
-        <w:pStyle w:val="BodyText"/>
-      </w:pPr>
-      <w:r>
-        <w:rPr>
-          <w:vertAlign w:val="superscript"/>
-        </w:rPr>
-        <w:t xml:space="preserve">1</w:t>
-      </w:r>
-      <w:r>
-        <w:t xml:space="preserve">Environment and Climate Change Canada, Wildlife and Landscape Science Directorate, Ottawa, Ontario, Canada</w:t>
-      </w:r>
-    </w:p>
-    <w:p>
-      <w:pPr>
-        <w:pStyle w:val="BodyText"/>
-      </w:pPr>
-      <w:r>
-        <w:rPr>
-          <w:vertAlign w:val="superscript"/>
-        </w:rPr>
-        <w:t xml:space="preserve">2</w:t>
-      </w:r>
-      <w:r>
-        <w:t xml:space="preserve">Environment and Climate Change Canada, Canadian Wildlife Service, Dartmouth, Nova Scotia, Canada</w:t>
-      </w:r>
-    </w:p>
-    <w:p>
-      <w:pPr>
-        <w:pStyle w:val="BodyText"/>
-      </w:pPr>
-      <w:r>
-        <w:rPr>
-          <w:vertAlign w:val="superscript"/>
-        </w:rPr>
-        <w:t xml:space="preserve">3</w:t>
-      </w:r>
-      <w:r>
-        <w:t xml:space="preserve">Environment and Climate Change Canada, Canadian Wildlife Service, Mount Pearl, Newfoundland and Labrador, Canada</w:t>
-      </w:r>
-    </w:p>
-    <w:p>
-      <w:pPr>
-        <w:pStyle w:val="BodyText"/>
-      </w:pPr>
-      <w:r>
-        <w:rPr>
-          <w:vertAlign w:val="superscript"/>
-        </w:rPr>
-        <w:t xml:space="preserve">4</w:t>
-      </w:r>
-      <w:r>
-        <w:t xml:space="preserve">Environment and Climate Change Canada, Canadian Wildlife Service, Québec, Québec, Canada</w:t>
-      </w:r>
-    </w:p>
-    <w:p>
-      <w:pPr>
-        <w:pStyle w:val="BodyText"/>
-      </w:pPr>
-      <w:r>
-        <w:rPr>
-          <w:vertAlign w:val="superscript"/>
-        </w:rPr>
-        <w:t xml:space="preserve">5</w:t>
-      </w:r>
-      <w:r>
-        <w:t xml:space="preserve">Environment and Climate Change Canada, Canadian Wildlife Service, Saint John, New Brunswick, Canada</w:t>
-      </w:r>
-    </w:p>
-    <w:p>
-      <w:pPr>
-        <w:pStyle w:val="BodyText"/>
-      </w:pPr>
-      <w:r>
-        <w:rPr>
-          <w:vertAlign w:val="superscript"/>
-        </w:rPr>
-        <w:t xml:space="preserve">6</w:t>
-      </w:r>
-      <w:r>
-        <w:t xml:space="preserve">Environment and Climate Change Canada, Canadian Wildlife Service, Toronto, Ontario, Canada</w:t>
-      </w:r>
-    </w:p>
-    <w:p>
-      <w:pPr>
-        <w:pStyle w:val="BodyText"/>
-      </w:pPr>
-      <w:r>
-        <w:rPr>
-          <w:vertAlign w:val="superscript"/>
-        </w:rPr>
-        <w:t xml:space="preserve">7</w:t>
-      </w:r>
-      <w:r>
-        <w:t xml:space="preserve">Memorial University of Newfoundland, Department of Psychology, St. John’s, Newfoundland and Labrador, Canada</w:t>
-      </w:r>
-    </w:p>
-    <w:p>
-      <w:pPr>
-        <w:pStyle w:val="BodyText"/>
-      </w:pPr>
-      <w:r>
-        <w:rPr>
-          <w:vertAlign w:val="superscript"/>
-        </w:rPr>
-        <w:t xml:space="preserve">8</w:t>
-      </w:r>
-      <w:r>
-        <w:t xml:space="preserve">Fisheries and Oceans Canada, St. John’s, Newfoundland and Labrador, Canada</w:t>
-      </w:r>
-    </w:p>
-    <w:p>
-      <w:pPr>
-        <w:pStyle w:val="BodyText"/>
-      </w:pPr>
-      <w:r>
-        <w:rPr>
-          <w:vertAlign w:val="superscript"/>
-        </w:rPr>
-        <w:t xml:space="preserve">9</w:t>
-      </w:r>
-      <w:r>
-        <w:t xml:space="preserve">Environment and Climate Change Canada, Wildlife and Landscape Science Directorate, Hamilton, Ontario, Canada</w:t>
-      </w:r>
-    </w:p>
-    <w:p>
-      <w:pPr>
-        <w:pStyle w:val="BodyText"/>
-      </w:pPr>
-      <w:r>
-        <w:rPr>
-          <w:vertAlign w:val="superscript"/>
-        </w:rPr>
-        <w:t xml:space="preserve">10</w:t>
-      </w:r>
-      <w:r>
-        <w:t xml:space="preserve">Environment and Climate Change Canada, Canadian Wildlife Service, St. John’s, Newfoundland and Labrador, Canada</w:t>
-      </w:r>
-    </w:p>
-    <w:p>
-      <w:pPr>
-        <w:pStyle w:val="BodyText"/>
-      </w:pPr>
-      <w:r>
-        <w:rPr>
-          <w:vertAlign w:val="superscript"/>
-        </w:rPr>
-        <w:t xml:space="preserve">11</w:t>
-      </w:r>
-      <w:r>
-        <w:t xml:space="preserve">Département des Sciences Biologiques, Université du Québec à Montréal, Montréal, Québec, Canada</w:t>
-      </w:r>
-    </w:p>
-    <w:p>
-      <w:pPr>
-        <w:pStyle w:val="BodyText"/>
-      </w:pPr>
-      <w:r>
-        <w:rPr>
-          <w:vertAlign w:val="superscript"/>
-        </w:rPr>
-        <w:t xml:space="preserve">12</w:t>
-      </w:r>
-      <w:r>
-        <w:t xml:space="preserve">Société Duvetnor Ltée, Montréal, Québec, Canada</w:t>
-      </w:r>
-    </w:p>
-    <w:p>
-      <w:pPr>
-        <w:pStyle w:val="BodyText"/>
-      </w:pPr>
-      <w:r>
-        <w:rPr>
-          <w:vertAlign w:val="superscript"/>
-        </w:rPr>
-        <w:t xml:space="preserve">13</w:t>
-      </w:r>
-      <w:r>
-        <w:t xml:space="preserve">Environment and Climate Change Canada, Canadian Wildlife Service, Halifax, Nova Scotia, Canada</w:t>
-      </w:r>
-    </w:p>
-    <w:p>
-      <w:pPr>
-        <w:pStyle w:val="BodyText"/>
-      </w:pPr>
-      <w:r>
-        <w:rPr>
-          <w:vertAlign w:val="superscript"/>
-        </w:rPr>
-        <w:t xml:space="preserve">14</w:t>
-      </w:r>
-      <w:r>
-        <w:t xml:space="preserve">Université du Québec à Rimouski, Department of Biology, Chemistry and Geography, Rimouski, Québec, Canada</w:t>
-      </w:r>
-    </w:p>
-    <w:p>
-      <w:pPr>
-        <w:pStyle w:val="BodyText"/>
-      </w:pPr>
-      <w:r>
-        <w:rPr>
-          <w:vertAlign w:val="superscript"/>
-        </w:rPr>
-        <w:t xml:space="preserve">15</w:t>
-      </w:r>
-      <w:r>
-        <w:t xml:space="preserve">Memorial University of Newfoundland, Department of Biology, St. John’s, Newfoundland and Labrador, Canada</w:t>
-      </w:r>
-    </w:p>
-    <w:p>
-      <w:pPr>
-        <w:pStyle w:val="BodyText"/>
-      </w:pPr>
-      <w:r>
-        <w:rPr>
-          <w:vertAlign w:val="superscript"/>
-        </w:rPr>
-        <w:t xml:space="preserve">16</w:t>
-      </w:r>
-      <w:r>
-        <w:t xml:space="preserve">University of Prince Edward Island, Department of Pathology and Microbiology, Charlottetown, Prince Edward Island, Canada</w:t>
-      </w:r>
-    </w:p>
-    <w:p>
-      <w:pPr>
-        <w:pStyle w:val="BodyText"/>
-      </w:pPr>
-      <w:r>
-        <w:rPr>
-          <w:vertAlign w:val="superscript"/>
-        </w:rPr>
-        <w:t xml:space="preserve">17</w:t>
-      </w:r>
-      <w:r>
-        <w:t xml:space="preserve">Canadian Wildlife Health Cooperative, Charlottetown, Prince Edward Island, Canada</w:t>
-      </w:r>
-    </w:p>
-    <w:p>
-      <w:pPr>
-        <w:pStyle w:val="BodyText"/>
-      </w:pPr>
-      <w:r>
-        <w:rPr>
-          <w:vertAlign w:val="superscript"/>
-        </w:rPr>
-        <w:t xml:space="preserve">18</w:t>
-      </w:r>
-      <w:r>
-        <w:t xml:space="preserve">Environment and Climate Change Canada, Canadian Wildlife Service, Sackville, New Brunswick, Canada</w:t>
-      </w:r>
-    </w:p>
-    <w:p>
-      <w:pPr>
-        <w:pStyle w:val="BodyText"/>
-      </w:pPr>
-      <w:r>
-        <w:rPr>
-          <w:vertAlign w:val="superscript"/>
-        </w:rPr>
-        <w:t xml:space="preserve">19</w:t>
-      </w:r>
-      <w:r>
-        <w:t xml:space="preserve">Université de Montréal, Faculté de médecine vétérinaire, Canadian Wildlife Health Cooperative, Centre québécois sur la santé des animaux sauvages, Montréal, Québec, Canada</w:t>
-      </w:r>
-    </w:p>
-    <w:p>
-      <w:pPr>
-        <w:pStyle w:val="BodyText"/>
-      </w:pPr>
-      <w:r>
-        <w:rPr>
-          <w:vertAlign w:val="superscript"/>
-        </w:rPr>
-        <w:t xml:space="preserve">20</w:t>
-      </w:r>
-      <w:r>
-        <w:t xml:space="preserve">Department of Natural Resources and Renewables, Halifax, Nova Scotia, Canada</w:t>
-      </w:r>
-    </w:p>
-    <w:p>
-      <w:pPr>
-        <w:pStyle w:val="BodyText"/>
-      </w:pPr>
-      <w:r>
-        <w:rPr>
-          <w:vertAlign w:val="superscript"/>
-        </w:rPr>
-        <w:t xml:space="preserve">21</w:t>
-      </w:r>
-      <w:r>
-        <w:t xml:space="preserve">Environment and Climate Change Canada, Wildlife and Landscape Science Directorate, Mount Pearl, Newfoundland and Labrador, Canada</w:t>
-      </w:r>
-    </w:p>
-    <w:p>
-      <w:pPr>
-        <w:pStyle w:val="BodyText"/>
-      </w:pPr>
-      <w:r>
-        <w:rPr>
-          <w:vertAlign w:val="superscript"/>
-        </w:rPr>
-        <w:t xml:space="preserve">22</w:t>
-      </w:r>
-      <w:r>
-        <w:t xml:space="preserve">Université du Québec à Rimouski, Department of Biology, Chemistry and Geography, Québec, Québec, Canada</w:t>
-      </w:r>
-    </w:p>
-    <w:p>
-      <w:pPr>
-        <w:pStyle w:val="BodyText"/>
-      </w:pPr>
-      <w:r>
-        <w:rPr>
-          <w:vertAlign w:val="superscript"/>
-        </w:rPr>
-        <w:t xml:space="preserve">23</w:t>
-      </w:r>
-      <w:r>
-        <w:t xml:space="preserve">Environment and Climate Change Canada, Wildlife and Landscape Science Directorate, Saskatoon, Saskatchewan, Canada</w:t>
-      </w:r>
-    </w:p>
-    <w:p>
-      <w:pPr>
-        <w:pStyle w:val="BodyText"/>
-      </w:pPr>
-      <w:r>
-        <w:rPr>
-          <w:vertAlign w:val="superscript"/>
-        </w:rPr>
-        <w:t xml:space="preserve">24</w:t>
       </w:r>
       <w:r>
         <w:t xml:space="preserve">Environment and Climate Change Canada, Canadian Wildlife Service, Happy-Valley Goose Bay, Newfoundland and Labrador, Canada</w:t>
@@ -705,7 +635,7 @@
         <w:t xml:space="preserve"> </w:t>
       </w:r>
       <w:r>
-        <w:t xml:space="preserve">Conceptualization, Formal analysis, Funding acquisition, Investigation, Methodology, Project administration, Resources, Software, Supervision, Visualization, Writing - original draft, Writing - review &amp; editing.</w:t>
+        <w:t xml:space="preserve">Conceptualization, Data curation, Formal analysis, Funding acquisition, Investigation, Methodology, Project administration, Resources, Software, Supervision, Visualization, Writing - original draft, Writing - review &amp; editing.</w:t>
       </w:r>
       <w:r>
         <w:t xml:space="preserve"> </w:t>
@@ -737,6 +667,182 @@
         <w:t xml:space="preserve"> </w:t>
       </w:r>
       <w:r>
+        <w:t xml:space="preserve">Conceptualization, Data curation, Investigation, Methodology, Writing - review &amp; editing.</w:t>
+      </w:r>
+      <w:r>
+        <w:t xml:space="preserve"> </w:t>
+      </w:r>
+      <w:r>
+        <w:rPr>
+          <w:bCs/>
+          <w:b/>
+        </w:rPr>
+        <w:t xml:space="preserve">Robert Ronconi:</w:t>
+      </w:r>
+      <w:r>
+        <w:t xml:space="preserve"> </w:t>
+      </w:r>
+      <w:r>
+        <w:t xml:space="preserve">Conceptualization, Investigation, Methodology, Writing - review &amp; editing.</w:t>
+      </w:r>
+      <w:r>
+        <w:t xml:space="preserve"> </w:t>
+      </w:r>
+      <w:r>
+        <w:rPr>
+          <w:bCs/>
+          <w:b/>
+        </w:rPr>
+        <w:t xml:space="preserve">Sabina I. Wilhelm:</w:t>
+      </w:r>
+      <w:r>
+        <w:t xml:space="preserve"> </w:t>
+      </w:r>
+      <w:r>
+        <w:t xml:space="preserve">Conceptualization, Investigation, Methodology, Writing - review &amp; editing.</w:t>
+      </w:r>
+      <w:r>
+        <w:t xml:space="preserve"> </w:t>
+      </w:r>
+      <w:r>
+        <w:rPr>
+          <w:bCs/>
+          <w:b/>
+        </w:rPr>
+        <w:t xml:space="preserve">Jean-François Rail:</w:t>
+      </w:r>
+      <w:r>
+        <w:t xml:space="preserve"> </w:t>
+      </w:r>
+      <w:r>
+        <w:t xml:space="preserve">Conceptualization, Investigation, Methodology, Writing - review &amp; editing.</w:t>
+      </w:r>
+      <w:r>
+        <w:t xml:space="preserve"> </w:t>
+      </w:r>
+      <w:r>
+        <w:rPr>
+          <w:bCs/>
+          <w:b/>
+        </w:rPr>
+        <w:t xml:space="preserve">Tabatha Cormier:</w:t>
+      </w:r>
+      <w:r>
+        <w:t xml:space="preserve"> </w:t>
+      </w:r>
+      <w:r>
+        <w:t xml:space="preserve">Data curation, Investigation, Methodology, Writing - review &amp; editing.</w:t>
+      </w:r>
+      <w:r>
+        <w:t xml:space="preserve"> </w:t>
+      </w:r>
+      <w:r>
+        <w:rPr>
+          <w:bCs/>
+          <w:b/>
+        </w:rPr>
+        <w:t xml:space="preserve">Matthieu Beaumont:</w:t>
+      </w:r>
+      <w:r>
+        <w:t xml:space="preserve"> </w:t>
+      </w:r>
+      <w:r>
+        <w:t xml:space="preserve">Conceptualization, Investigation, Methodology.</w:t>
+      </w:r>
+      <w:r>
+        <w:t xml:space="preserve"> </w:t>
+      </w:r>
+      <w:r>
+        <w:rPr>
+          <w:bCs/>
+          <w:b/>
+        </w:rPr>
+        <w:t xml:space="preserve">Campbell Bowser:</w:t>
+      </w:r>
+      <w:r>
+        <w:t xml:space="preserve"> </w:t>
+      </w:r>
+      <w:r>
+        <w:t xml:space="preserve">Investigation, Methodology, Software, Validation, Visualization, Writing - review &amp; editing.</w:t>
+      </w:r>
+      <w:r>
+        <w:t xml:space="preserve"> </w:t>
+      </w:r>
+      <w:r>
+        <w:rPr>
+          <w:bCs/>
+          <w:b/>
+        </w:rPr>
+        <w:t xml:space="preserve">Tori V. Burt:</w:t>
+      </w:r>
+      <w:r>
+        <w:t xml:space="preserve"> </w:t>
+      </w:r>
+      <w:r>
+        <w:t xml:space="preserve">Conceptualization, Data curation, Investigation, Methodology, Writing - review &amp; editing.</w:t>
+      </w:r>
+      <w:r>
+        <w:t xml:space="preserve"> </w:t>
+      </w:r>
+      <w:r>
+        <w:rPr>
+          <w:bCs/>
+          <w:b/>
+        </w:rPr>
+        <w:t xml:space="preserve">Sydney Collins:</w:t>
+      </w:r>
+      <w:r>
+        <w:t xml:space="preserve"> </w:t>
+      </w:r>
+      <w:r>
+        <w:t xml:space="preserve">Conceptualization, Data curation, Investigation, Methodology, Writing - review &amp; editing.</w:t>
+      </w:r>
+      <w:r>
+        <w:t xml:space="preserve"> </w:t>
+      </w:r>
+      <w:r>
+        <w:rPr>
+          <w:bCs/>
+          <w:b/>
+        </w:rPr>
+        <w:t xml:space="preserve">Steven Duffy:</w:t>
+      </w:r>
+      <w:r>
+        <w:t xml:space="preserve"> </w:t>
+      </w:r>
+      <w:r>
+        <w:t xml:space="preserve">Investigation, Methodology.</w:t>
+      </w:r>
+      <w:r>
+        <w:t xml:space="preserve"> </w:t>
+      </w:r>
+      <w:r>
+        <w:rPr>
+          <w:bCs/>
+          <w:b/>
+        </w:rPr>
+        <w:t xml:space="preserve">Jolene A. Giacinti:</w:t>
+      </w:r>
+      <w:r>
+        <w:t xml:space="preserve"> </w:t>
+      </w:r>
+      <w:r>
+        <w:t xml:space="preserve">Conceptualization, Data curation, Investigation, Methodology, Writing - review &amp; editing.</w:t>
+      </w:r>
+      <w:r>
+        <w:t xml:space="preserve"> </w:t>
+      </w:r>
+      <w:r>
+        <w:rPr>
+          <w:bCs/>
+          <w:b/>
+        </w:rPr>
+        <w:t xml:space="preserve">Scott Gilliland:</w:t>
+      </w:r>
+      <w:r>
+        <w:t xml:space="preserve"> </w:t>
+      </w:r>
+      <w:r>
         <w:t xml:space="preserve">Investigation, Methodology, Writing - review &amp; editing.</w:t>
       </w:r>
       <w:r>
@@ -747,7 +853,87 @@
           <w:bCs/>
           <w:b/>
         </w:rPr>
-        <w:t xml:space="preserve">Robert Ronconi:</w:t>
+        <w:t xml:space="preserve">Jean-François Giroux:</w:t>
+      </w:r>
+      <w:r>
+        <w:t xml:space="preserve"> </w:t>
+      </w:r>
+      <w:r>
+        <w:t xml:space="preserve">Conceptualization, Funding acquisition, Investigation, Methodology, Supervision, Writing - review &amp; editing.</w:t>
+      </w:r>
+      <w:r>
+        <w:t xml:space="preserve"> </w:t>
+      </w:r>
+      <w:r>
+        <w:rPr>
+          <w:bCs/>
+          <w:b/>
+        </w:rPr>
+        <w:t xml:space="preserve">Carina Gjerdrum:</w:t>
+      </w:r>
+      <w:r>
+        <w:t xml:space="preserve"> </w:t>
+      </w:r>
+      <w:r>
+        <w:t xml:space="preserve">Conceptualization, Investigation, Methodology, Writing - review &amp; editing.</w:t>
+      </w:r>
+      <w:r>
+        <w:t xml:space="preserve"> </w:t>
+      </w:r>
+      <w:r>
+        <w:rPr>
+          <w:bCs/>
+          <w:b/>
+        </w:rPr>
+        <w:t xml:space="preserve">Magella Guillemette:</w:t>
+      </w:r>
+      <w:r>
+        <w:t xml:space="preserve"> </w:t>
+      </w:r>
+      <w:r>
+        <w:t xml:space="preserve">Funding acquisition, Investigation, Methodology, Supervision.</w:t>
+      </w:r>
+      <w:r>
+        <w:t xml:space="preserve"> </w:t>
+      </w:r>
+      <w:r>
+        <w:rPr>
+          <w:bCs/>
+          <w:b/>
+        </w:rPr>
+        <w:t xml:space="preserve">Kathryn E. Hargan:</w:t>
+      </w:r>
+      <w:r>
+        <w:t xml:space="preserve"> </w:t>
+      </w:r>
+      <w:r>
+        <w:t xml:space="preserve">Funding acquisition, Investigation, Methodology, Supervision.</w:t>
+      </w:r>
+      <w:r>
+        <w:t xml:space="preserve"> </w:t>
+      </w:r>
+      <w:r>
+        <w:rPr>
+          <w:bCs/>
+          <w:b/>
+        </w:rPr>
+        <w:t xml:space="preserve">Megan Jones:</w:t>
+      </w:r>
+      <w:r>
+        <w:t xml:space="preserve"> </w:t>
+      </w:r>
+      <w:r>
+        <w:t xml:space="preserve">Conceptualization, Data curation, Funding acquisition, Investigation, Methodology, Supervision.</w:t>
+      </w:r>
+      <w:r>
+        <w:t xml:space="preserve"> </w:t>
+      </w:r>
+      <w:r>
+        <w:rPr>
+          <w:bCs/>
+          <w:b/>
+        </w:rPr>
+        <w:t xml:space="preserve">Andrew Kennedy:</w:t>
       </w:r>
       <w:r>
         <w:t xml:space="preserve"> </w:t>
@@ -763,7 +949,87 @@
           <w:bCs/>
           <w:b/>
         </w:rPr>
-        <w:t xml:space="preserve">Sabina I. Wilhelm:</w:t>
+        <w:t xml:space="preserve">Stéphane Lair:</w:t>
+      </w:r>
+      <w:r>
+        <w:t xml:space="preserve"> </w:t>
+      </w:r>
+      <w:r>
+        <w:t xml:space="preserve">Conceptualization, Data curation, Funding acquisition, Investigation, Methodology, Supervision, Writing - review &amp; editing.</w:t>
+      </w:r>
+      <w:r>
+        <w:t xml:space="preserve"> </w:t>
+      </w:r>
+      <w:r>
+        <w:rPr>
+          <w:bCs/>
+          <w:b/>
+        </w:rPr>
+        <w:t xml:space="preserve">Andrew Lang:</w:t>
+      </w:r>
+      <w:r>
+        <w:t xml:space="preserve"> </w:t>
+      </w:r>
+      <w:r>
+        <w:t xml:space="preserve">Funding acquisition, Investigation, Methodology, Supervision, Writing - review &amp; editing.</w:t>
+      </w:r>
+      <w:r>
+        <w:t xml:space="preserve"> </w:t>
+      </w:r>
+      <w:r>
+        <w:rPr>
+          <w:bCs/>
+          <w:b/>
+        </w:rPr>
+        <w:t xml:space="preserve">Christine Lepage:</w:t>
+      </w:r>
+      <w:r>
+        <w:t xml:space="preserve"> </w:t>
+      </w:r>
+      <w:r>
+        <w:t xml:space="preserve">Data curation, Investigation, Methodology, Writing - review &amp; editing.</w:t>
+      </w:r>
+      <w:r>
+        <w:t xml:space="preserve"> </w:t>
+      </w:r>
+      <w:r>
+        <w:rPr>
+          <w:bCs/>
+          <w:b/>
+        </w:rPr>
+        <w:t xml:space="preserve">Gretchen McPhail:</w:t>
+      </w:r>
+      <w:r>
+        <w:t xml:space="preserve"> </w:t>
+      </w:r>
+      <w:r>
+        <w:t xml:space="preserve">Conceptualization, Data curation, Investigation, Methodology, Writing - review &amp; editing.</w:t>
+      </w:r>
+      <w:r>
+        <w:t xml:space="preserve"> </w:t>
+      </w:r>
+      <w:r>
+        <w:rPr>
+          <w:bCs/>
+          <w:b/>
+        </w:rPr>
+        <w:t xml:space="preserve">William A. Montevecchi:</w:t>
+      </w:r>
+      <w:r>
+        <w:t xml:space="preserve"> </w:t>
+      </w:r>
+      <w:r>
+        <w:t xml:space="preserve">Conceptualization, Data curation, Funding acquisition, Investigation, Methodology, Supervision, Writing - review &amp; editing.</w:t>
+      </w:r>
+      <w:r>
+        <w:t xml:space="preserve"> </w:t>
+      </w:r>
+      <w:r>
+        <w:rPr>
+          <w:bCs/>
+          <w:b/>
+        </w:rPr>
+        <w:t xml:space="preserve">Glen J. Parsons:</w:t>
       </w:r>
       <w:r>
         <w:t xml:space="preserve"> </w:t>
@@ -779,7 +1045,23 @@
           <w:bCs/>
           <w:b/>
         </w:rPr>
-        <w:t xml:space="preserve">Jean-François Rail:</w:t>
+        <w:t xml:space="preserve">Jennifer P. Provencher:</w:t>
+      </w:r>
+      <w:r>
+        <w:t xml:space="preserve"> </w:t>
+      </w:r>
+      <w:r>
+        <w:t xml:space="preserve">Writing - review &amp; editing.</w:t>
+      </w:r>
+      <w:r>
+        <w:t xml:space="preserve"> </w:t>
+      </w:r>
+      <w:r>
+        <w:rPr>
+          <w:bCs/>
+          <w:b/>
+        </w:rPr>
+        <w:t xml:space="preserve">Ishraq Rahman:</w:t>
       </w:r>
       <w:r>
         <w:t xml:space="preserve"> </w:t>
@@ -795,39 +1077,23 @@
           <w:bCs/>
           <w:b/>
         </w:rPr>
-        <w:t xml:space="preserve">Tabatha Cormier:</w:t>
-      </w:r>
-      <w:r>
-        <w:t xml:space="preserve"> </w:t>
-      </w:r>
-      <w:r>
-        <w:t xml:space="preserve">Writing - review &amp; editing.</w:t>
-      </w:r>
-      <w:r>
-        <w:t xml:space="preserve"> </w:t>
-      </w:r>
-      <w:r>
-        <w:rPr>
-          <w:bCs/>
-          <w:b/>
-        </w:rPr>
-        <w:t xml:space="preserve">Campbell Bowser:</w:t>
-      </w:r>
-      <w:r>
-        <w:t xml:space="preserve"> </w:t>
-      </w:r>
-      <w:r>
-        <w:t xml:space="preserve">Investigation, Methodology.</w:t>
-      </w:r>
-      <w:r>
-        <w:t xml:space="preserve"> </w:t>
-      </w:r>
-      <w:r>
-        <w:rPr>
-          <w:bCs/>
-          <w:b/>
-        </w:rPr>
-        <w:t xml:space="preserve">Tori V. Burt:</w:t>
+        <w:t xml:space="preserve">Gregory J. Robertson:</w:t>
+      </w:r>
+      <w:r>
+        <w:t xml:space="preserve"> </w:t>
+      </w:r>
+      <w:r>
+        <w:t xml:space="preserve">Conceptualization, Writing - review &amp; editing.</w:t>
+      </w:r>
+      <w:r>
+        <w:t xml:space="preserve"> </w:t>
+      </w:r>
+      <w:r>
+        <w:rPr>
+          <w:bCs/>
+          <w:b/>
+        </w:rPr>
+        <w:t xml:space="preserve">Yannick Seyer:</w:t>
       </w:r>
       <w:r>
         <w:t xml:space="preserve"> </w:t>
@@ -843,301 +1109,29 @@
           <w:bCs/>
           <w:b/>
         </w:rPr>
-        <w:t xml:space="preserve">Sydney Collins:</w:t>
-      </w:r>
-      <w:r>
-        <w:t xml:space="preserve"> </w:t>
-      </w:r>
-      <w:r>
-        <w:t xml:space="preserve">Data curation, Investigation, Methodology, Writing - review &amp; editing.</w:t>
-      </w:r>
-      <w:r>
-        <w:t xml:space="preserve"> </w:t>
-      </w:r>
-      <w:r>
-        <w:rPr>
-          <w:bCs/>
-          <w:b/>
-        </w:rPr>
-        <w:t xml:space="preserve">Steven Duffy:</w:t>
-      </w:r>
-      <w:r>
-        <w:t xml:space="preserve"> </w:t>
-      </w:r>
-      <w:r>
-        <w:t xml:space="preserve">Investigation, Methodology.</w:t>
-      </w:r>
-      <w:r>
-        <w:t xml:space="preserve"> </w:t>
-      </w:r>
-      <w:r>
-        <w:rPr>
-          <w:bCs/>
-          <w:b/>
-        </w:rPr>
-        <w:t xml:space="preserve">Jolene A. Giacinti:</w:t>
-      </w:r>
-      <w:r>
-        <w:t xml:space="preserve"> </w:t>
-      </w:r>
-      <w:r>
-        <w:t xml:space="preserve">Conceptualization, Data curation, Investigation, Methodology, Writing - review &amp; editing.</w:t>
-      </w:r>
-      <w:r>
-        <w:t xml:space="preserve"> </w:t>
-      </w:r>
-      <w:r>
-        <w:rPr>
-          <w:bCs/>
-          <w:b/>
-        </w:rPr>
-        <w:t xml:space="preserve">Scott Gilliland:</w:t>
-      </w:r>
-      <w:r>
-        <w:t xml:space="preserve"> </w:t>
-      </w:r>
-      <w:r>
-        <w:t xml:space="preserve">Data curation, Investigation, Methodology, Writing - review &amp; editing.</w:t>
-      </w:r>
-      <w:r>
-        <w:t xml:space="preserve"> </w:t>
-      </w:r>
-      <w:r>
-        <w:rPr>
-          <w:bCs/>
-          <w:b/>
-        </w:rPr>
-        <w:t xml:space="preserve">Jean-François Giroux:</w:t>
-      </w:r>
-      <w:r>
-        <w:t xml:space="preserve"> </w:t>
-      </w:r>
-      <w:r>
-        <w:t xml:space="preserve">Data curation, Funding acquisition, Investigation, Methodology, Resources, Writing - review &amp; editing.</w:t>
-      </w:r>
-      <w:r>
-        <w:t xml:space="preserve"> </w:t>
-      </w:r>
-      <w:r>
-        <w:rPr>
-          <w:bCs/>
-          <w:b/>
-        </w:rPr>
-        <w:t xml:space="preserve">Carina Gjerdrum:</w:t>
-      </w:r>
-      <w:r>
-        <w:t xml:space="preserve"> </w:t>
-      </w:r>
-      <w:r>
-        <w:t xml:space="preserve">Data curation, Investigation, Methodology, Writing - review &amp; editing.</w:t>
-      </w:r>
-      <w:r>
-        <w:t xml:space="preserve"> </w:t>
-      </w:r>
-      <w:r>
-        <w:rPr>
-          <w:bCs/>
-          <w:b/>
-        </w:rPr>
-        <w:t xml:space="preserve">Magella Guillemette:</w:t>
-      </w:r>
-      <w:r>
-        <w:t xml:space="preserve"> </w:t>
-      </w:r>
-      <w:r>
-        <w:t xml:space="preserve">Investigation, Methodology.</w:t>
-      </w:r>
-      <w:r>
-        <w:t xml:space="preserve"> </w:t>
-      </w:r>
-      <w:r>
-        <w:rPr>
-          <w:bCs/>
-          <w:b/>
-        </w:rPr>
-        <w:t xml:space="preserve">Kathryn E. Hargan:</w:t>
-      </w:r>
-      <w:r>
-        <w:t xml:space="preserve"> </w:t>
-      </w:r>
-      <w:r>
-        <w:t xml:space="preserve">Investigation, Methodology, Resources, Supervision.</w:t>
-      </w:r>
-      <w:r>
-        <w:t xml:space="preserve"> </w:t>
-      </w:r>
-      <w:r>
-        <w:rPr>
-          <w:bCs/>
-          <w:b/>
-        </w:rPr>
-        <w:t xml:space="preserve">Megan Jones:</w:t>
-      </w:r>
-      <w:r>
-        <w:t xml:space="preserve"> </w:t>
-      </w:r>
-      <w:r>
-        <w:t xml:space="preserve">Investigation, Methodology.</w:t>
-      </w:r>
-      <w:r>
-        <w:t xml:space="preserve"> </w:t>
-      </w:r>
-      <w:r>
-        <w:rPr>
-          <w:bCs/>
-          <w:b/>
-        </w:rPr>
-        <w:t xml:space="preserve">Stéphane Lair:</w:t>
-      </w:r>
-      <w:r>
-        <w:t xml:space="preserve"> </w:t>
-      </w:r>
-      <w:r>
-        <w:t xml:space="preserve">Investigation, Methodology.</w:t>
-      </w:r>
-      <w:r>
-        <w:t xml:space="preserve"> </w:t>
-      </w:r>
-      <w:r>
-        <w:rPr>
-          <w:bCs/>
-          <w:b/>
-        </w:rPr>
-        <w:t xml:space="preserve">Andrew Lang:</w:t>
-      </w:r>
-      <w:r>
-        <w:t xml:space="preserve"> </w:t>
-      </w:r>
-      <w:r>
-        <w:t xml:space="preserve">Investigation, Methodology, Resources, Supervision.</w:t>
-      </w:r>
-      <w:r>
-        <w:t xml:space="preserve"> </w:t>
-      </w:r>
-      <w:r>
-        <w:rPr>
-          <w:bCs/>
-          <w:b/>
-        </w:rPr>
-        <w:t xml:space="preserve">Christine Lepage:</w:t>
-      </w:r>
-      <w:r>
-        <w:t xml:space="preserve"> </w:t>
-      </w:r>
-      <w:r>
-        <w:t xml:space="preserve">Data curation, Investigation, Methodology, Writing - review &amp; editing.</w:t>
-      </w:r>
-      <w:r>
-        <w:t xml:space="preserve"> </w:t>
-      </w:r>
-      <w:r>
-        <w:rPr>
-          <w:bCs/>
-          <w:b/>
-        </w:rPr>
-        <w:t xml:space="preserve">Gretchen McPhail:</w:t>
-      </w:r>
-      <w:r>
-        <w:t xml:space="preserve"> </w:t>
-      </w:r>
-      <w:r>
-        <w:t xml:space="preserve">Data curation, Investigation, Methodology.</w:t>
-      </w:r>
-      <w:r>
-        <w:t xml:space="preserve"> </w:t>
-      </w:r>
-      <w:r>
-        <w:rPr>
-          <w:bCs/>
-          <w:b/>
-        </w:rPr>
-        <w:t xml:space="preserve">William A. Montevecchi:</w:t>
-      </w:r>
-      <w:r>
-        <w:t xml:space="preserve"> </w:t>
-      </w:r>
-      <w:r>
-        <w:t xml:space="preserve">Conceptualization, Data curation, Funding acquisition, Investigation, Methodology, Project administration, Supervision, Writing - review &amp; editing.</w:t>
-      </w:r>
-      <w:r>
-        <w:t xml:space="preserve"> </w:t>
-      </w:r>
-      <w:r>
-        <w:rPr>
-          <w:bCs/>
-          <w:b/>
-        </w:rPr>
-        <w:t xml:space="preserve">Glen J. Parsons:</w:t>
-      </w:r>
-      <w:r>
-        <w:t xml:space="preserve"> </w:t>
-      </w:r>
-      <w:r>
-        <w:t xml:space="preserve">Investigation, Methodology, Writing - review &amp; editing.</w:t>
-      </w:r>
-      <w:r>
-        <w:t xml:space="preserve"> </w:t>
-      </w:r>
-      <w:r>
-        <w:rPr>
-          <w:bCs/>
-          <w:b/>
-        </w:rPr>
-        <w:t xml:space="preserve">Ishraq Rahman:</w:t>
-      </w:r>
-      <w:r>
-        <w:t xml:space="preserve"> </w:t>
-      </w:r>
-      <w:r>
-        <w:t xml:space="preserve">Investigation, Methodology.</w:t>
-      </w:r>
-      <w:r>
-        <w:t xml:space="preserve"> </w:t>
-      </w:r>
-      <w:r>
-        <w:rPr>
-          <w:bCs/>
-          <w:b/>
-        </w:rPr>
-        <w:t xml:space="preserve">Gregory J. Robertson:</w:t>
-      </w:r>
-      <w:r>
-        <w:t xml:space="preserve"> </w:t>
-      </w:r>
-      <w:r>
-        <w:t xml:space="preserve">Conceptualization, Writing - review &amp; editing.</w:t>
-      </w:r>
-      <w:r>
-        <w:t xml:space="preserve"> </w:t>
-      </w:r>
-      <w:r>
-        <w:rPr>
-          <w:bCs/>
-          <w:b/>
-        </w:rPr>
-        <w:t xml:space="preserve">Yannick Seyer:</w:t>
-      </w:r>
-      <w:r>
-        <w:t xml:space="preserve"> </w:t>
-      </w:r>
-      <w:r>
-        <w:t xml:space="preserve">Investigation, Methodology.</w:t>
-      </w:r>
-      <w:r>
-        <w:t xml:space="preserve"> </w:t>
-      </w:r>
-      <w:r>
-        <w:rPr>
-          <w:bCs/>
-          <w:b/>
-        </w:rPr>
         <w:t xml:space="preserve">Christopher R. E. Ward:</w:t>
       </w:r>
       <w:r>
         <w:t xml:space="preserve"> </w:t>
       </w:r>
       <w:r>
-        <w:t xml:space="preserve">Investigation, Methodology, Writing - review &amp; editing.</w:t>
+        <w:t xml:space="preserve">Conceptualization, Investigation, Methodology, Writing - review &amp; editing.</w:t>
+      </w:r>
+      <w:r>
+        <w:t xml:space="preserve"> </w:t>
+      </w:r>
+      <w:r>
+        <w:rPr>
+          <w:bCs/>
+          <w:b/>
+        </w:rPr>
+        <w:t xml:space="preserve">Regina Wells:</w:t>
+      </w:r>
+      <w:r>
+        <w:t xml:space="preserve"> </w:t>
+      </w:r>
+      <w:r>
+        <w:t xml:space="preserve">Conceptualization, Investigation, Methodology.</w:t>
       </w:r>
       <w:r>
         <w:t xml:space="preserve"> </w:t>

</xml_diff>

<commit_message>
Updated code to work with _1 suffix on city, province country.
</commit_message>
<xml_diff>
--- a/Author-List.docx
+++ b/Author-List.docx
@@ -347,7 +347,7 @@
         <w:t xml:space="preserve">1</w:t>
       </w:r>
       <w:r>
-        <w:t xml:space="preserve">Environment and Climate Change Canada, Wildlife and Landscape Science Directorate, Ottawa, Ontario, Canada</w:t>
+        <w:t xml:space="preserve">Environment and Climate Change Canada, Wildlife and Landscape Science Directorate, Ottawa, Ontario</w:t>
       </w:r>
     </w:p>
     <w:p>
@@ -361,7 +361,7 @@
         <w:t xml:space="preserve">2</w:t>
       </w:r>
       <w:r>
-        <w:t xml:space="preserve">Environment and Climate Change Canada, Canadian Wildlife Service, Dartmouth, Nova Scotia, Canada</w:t>
+        <w:t xml:space="preserve">Environment and Climate Change Canada, Canadian Wildlife Service, Dartmouth, Nova Scotia</w:t>
       </w:r>
     </w:p>
     <w:p>
@@ -375,7 +375,7 @@
         <w:t xml:space="preserve">3</w:t>
       </w:r>
       <w:r>
-        <w:t xml:space="preserve">Environment and Climate Change Canada, Canadian Wildlife Service, Mount Pearl, Newfoundland and Labrador, Canada</w:t>
+        <w:t xml:space="preserve">Environment and Climate Change Canada, Canadian Wildlife Service, Mount Pearl, Newfoundland and Labrador</w:t>
       </w:r>
     </w:p>
     <w:p>
@@ -389,7 +389,7 @@
         <w:t xml:space="preserve">4</w:t>
       </w:r>
       <w:r>
-        <w:t xml:space="preserve">Environment and Climate Change Canada, Canadian Wildlife Service, Québec, Québec, Canada</w:t>
+        <w:t xml:space="preserve">Environment and Climate Change Canada, Canadian Wildlife Service, Québec, Québec</w:t>
       </w:r>
     </w:p>
     <w:p>
@@ -403,7 +403,7 @@
         <w:t xml:space="preserve">5</w:t>
       </w:r>
       <w:r>
-        <w:t xml:space="preserve">Environment and Climate Change Canada, Canadian Wildlife Service, Sackville, New Brunswick, Canada</w:t>
+        <w:t xml:space="preserve">Environment and Climate Change Canada, Canadian Wildlife Service, Sackville, New Brunswick</w:t>
       </w:r>
     </w:p>
     <w:p>
@@ -417,7 +417,7 @@
         <w:t xml:space="preserve">6</w:t>
       </w:r>
       <w:r>
-        <w:t xml:space="preserve">Memorial University of Newfoundland, Department of Psychology, St. John’s, Newfoundland and Labrador, Canada</w:t>
+        <w:t xml:space="preserve">Memorial University of Newfoundland, Department of Psychology, St. John’s, Newfoundland and Labrador</w:t>
       </w:r>
     </w:p>
     <w:p>
@@ -431,7 +431,7 @@
         <w:t xml:space="preserve">7</w:t>
       </w:r>
       <w:r>
-        <w:t xml:space="preserve">Fisheries and Oceans Canada, Mount Pearl, Newfoundland and Labrador, Canada</w:t>
+        <w:t xml:space="preserve">Fisheries and Oceans Canada, Mount Pearl, Newfoundland and Labrador</w:t>
       </w:r>
     </w:p>
     <w:p>
@@ -445,7 +445,7 @@
         <w:t xml:space="preserve">8</w:t>
       </w:r>
       <w:r>
-        <w:t xml:space="preserve">Département des Sciences Biologiques, Université du Québec à Montréal, Montréal, Québec, Canada</w:t>
+        <w:t xml:space="preserve">Département des Sciences Biologiques, Université du Québec à Montréal, Montréal, Québec</w:t>
       </w:r>
     </w:p>
     <w:p>
@@ -459,7 +459,7 @@
         <w:t xml:space="preserve">9</w:t>
       </w:r>
       <w:r>
-        <w:t xml:space="preserve">Société Duvetnor Ltée, Montréal, Québec, Canada</w:t>
+        <w:t xml:space="preserve">Société Duvetnor Ltée, Montréal, Québec</w:t>
       </w:r>
     </w:p>
     <w:p>
@@ -473,7 +473,7 @@
         <w:t xml:space="preserve">10</w:t>
       </w:r>
       <w:r>
-        <w:t xml:space="preserve">Université du Québec à Rimouski, Department of Biology, Chemistry and Geography, Rimouski, Québec, Canada</w:t>
+        <w:t xml:space="preserve">Université du Québec à Rimouski, Department of Biology, Chemistry and Geography, Rimouski, Québec</w:t>
       </w:r>
     </w:p>
     <w:p>
@@ -487,7 +487,7 @@
         <w:t xml:space="preserve">11</w:t>
       </w:r>
       <w:r>
-        <w:t xml:space="preserve">Memorial University of Newfoundland, Department of Biology, St. John’s, Newfoundland and Labrador, Canada</w:t>
+        <w:t xml:space="preserve">Memorial University of Newfoundland, Department of Biology, St. John’s, Newfoundland and Labrador</w:t>
       </w:r>
     </w:p>
     <w:p>
@@ -501,7 +501,7 @@
         <w:t xml:space="preserve">12</w:t>
       </w:r>
       <w:r>
-        <w:t xml:space="preserve">University of Prince Edward Island, Department of Pathology and Microbiology, Charlottetown, Prince Edward Island, Canada</w:t>
+        <w:t xml:space="preserve">University of Prince Edward Island, Department of Pathology and Microbiology, Charlottetown, Prince Edward Island</w:t>
       </w:r>
     </w:p>
     <w:p>
@@ -515,7 +515,7 @@
         <w:t xml:space="preserve">13</w:t>
       </w:r>
       <w:r>
-        <w:t xml:space="preserve">Canadian Wildlife Health Cooperative, Charlottetown, Prince Edward Island, Canada</w:t>
+        <w:t xml:space="preserve">Canadian Wildlife Health Cooperative, Charlottetown, Prince Edward Island</w:t>
       </w:r>
     </w:p>
     <w:p>
@@ -529,7 +529,7 @@
         <w:t xml:space="preserve">14</w:t>
       </w:r>
       <w:r>
-        <w:t xml:space="preserve">Université de Montréal, Faculté de médecine vétérinaire, Canadian Wildlife Health Cooperative, Centre québécois sur la santé des animaux sauvages, Montréal, Québec, Canada</w:t>
+        <w:t xml:space="preserve">Université de Montréal, Faculté de médecine vétérinaire, Canadian Wildlife Health Cooperative, Centre québécois sur la santé des animaux sauvages, Montréal, Québec</w:t>
       </w:r>
     </w:p>
     <w:p>
@@ -543,7 +543,7 @@
         <w:t xml:space="preserve">15</w:t>
       </w:r>
       <w:r>
-        <w:t xml:space="preserve">Department of Natural Resources and Renewables, Halifax, Nova Scotia, Canada</w:t>
+        <w:t xml:space="preserve">Department of Natural Resources and Renewables, Halifax, Nova Scotia</w:t>
       </w:r>
     </w:p>
     <w:p>
@@ -557,7 +557,7 @@
         <w:t xml:space="preserve">16</w:t>
       </w:r>
       <w:r>
-        <w:t xml:space="preserve">Environment and Climate Change Canada, Wildlife and Landscape Science Directorate, Mount Pearl, Newfoundland and Labrador, Canada</w:t>
+        <w:t xml:space="preserve">Environment and Climate Change Canada, Wildlife and Landscape Science Directorate, Mount Pearl, Newfoundland and Labrador</w:t>
       </w:r>
     </w:p>
     <w:p>
@@ -571,7 +571,7 @@
         <w:t xml:space="preserve">17</w:t>
       </w:r>
       <w:r>
-        <w:t xml:space="preserve">Université du Québec à Rimouski, Department of Biology, Chemistry and Geography, Québec, Québec, Canada</w:t>
+        <w:t xml:space="preserve">Université du Québec à Rimouski, Department of Biology, Chemistry and Geography, Québec, Québec</w:t>
       </w:r>
     </w:p>
     <w:p>
@@ -585,7 +585,7 @@
         <w:t xml:space="preserve">18</w:t>
       </w:r>
       <w:r>
-        <w:t xml:space="preserve">Environment and Climate Change Canada, Wildlife and Landscape Science Directorate, Saskatoon, Saskatchewan, Canada</w:t>
+        <w:t xml:space="preserve">Environment and Climate Change Canada, Wildlife and Landscape Science Directorate, Saskatoon, Saskatchewan</w:t>
       </w:r>
     </w:p>
     <w:p>
@@ -599,7 +599,7 @@
         <w:t xml:space="preserve">19</w:t>
       </w:r>
       <w:r>
-        <w:t xml:space="preserve">Environment and Climate Change Canada, Canadian Wildlife Service, Happy-Valley Goose Bay, Newfoundland and Labrador, Canada</w:t>
+        <w:t xml:space="preserve">Environment and Climate Change Canada, Canadian Wildlife Service, Happy-Valley Goose Bay, Newfoundland and Labrador</w:t>
       </w:r>
     </w:p>
     <w:bookmarkEnd w:id="20"/>
@@ -859,7 +859,7 @@
         <w:t xml:space="preserve"> </w:t>
       </w:r>
       <w:r>
-        <w:t xml:space="preserve">Conceptualization, Funding acquisition, Investigation, Methodology, Supervision, Writing - review &amp; editing.</w:t>
+        <w:t xml:space="preserve">Conceptualization, Investigation, Methodology, Supervision, Writing - review &amp; editing.</w:t>
       </w:r>
       <w:r>
         <w:t xml:space="preserve"> </w:t>
@@ -891,7 +891,7 @@
         <w:t xml:space="preserve"> </w:t>
       </w:r>
       <w:r>
-        <w:t xml:space="preserve">Funding acquisition, Investigation, Methodology, Supervision.</w:t>
+        <w:t xml:space="preserve">Investigation, Methodology, Supervision.</w:t>
       </w:r>
       <w:r>
         <w:t xml:space="preserve"> </w:t>
@@ -907,7 +907,7 @@
         <w:t xml:space="preserve"> </w:t>
       </w:r>
       <w:r>
-        <w:t xml:space="preserve">Funding acquisition, Investigation, Methodology, Supervision.</w:t>
+        <w:t xml:space="preserve">Investigation, Methodology, Supervision.</w:t>
       </w:r>
       <w:r>
         <w:t xml:space="preserve"> </w:t>
@@ -923,7 +923,7 @@
         <w:t xml:space="preserve"> </w:t>
       </w:r>
       <w:r>
-        <w:t xml:space="preserve">Conceptualization, Data curation, Funding acquisition, Investigation, Methodology, Supervision.</w:t>
+        <w:t xml:space="preserve">Conceptualization, Data curation, Investigation, Methodology, Supervision.</w:t>
       </w:r>
       <w:r>
         <w:t xml:space="preserve"> </w:t>
@@ -955,7 +955,7 @@
         <w:t xml:space="preserve"> </w:t>
       </w:r>
       <w:r>
-        <w:t xml:space="preserve">Conceptualization, Data curation, Funding acquisition, Investigation, Methodology, Supervision, Writing - review &amp; editing.</w:t>
+        <w:t xml:space="preserve">Conceptualization, Data curation, Investigation, Methodology, Supervision, Writing - review &amp; editing.</w:t>
       </w:r>
       <w:r>
         <w:t xml:space="preserve"> </w:t>
@@ -971,7 +971,7 @@
         <w:t xml:space="preserve"> </w:t>
       </w:r>
       <w:r>
-        <w:t xml:space="preserve">Funding acquisition, Investigation, Methodology, Supervision, Writing - review &amp; editing.</w:t>
+        <w:t xml:space="preserve">Investigation, Methodology, Supervision, Writing - review &amp; editing.</w:t>
       </w:r>
       <w:r>
         <w:t xml:space="preserve"> </w:t>
@@ -1019,7 +1019,7 @@
         <w:t xml:space="preserve"> </w:t>
       </w:r>
       <w:r>
-        <w:t xml:space="preserve">Conceptualization, Data curation, Funding acquisition, Investigation, Methodology, Supervision, Writing - review &amp; editing.</w:t>
+        <w:t xml:space="preserve">Conceptualization, Data curation, Investigation, Methodology, Supervision, Writing - review &amp; editing.</w:t>
       </w:r>
       <w:r>
         <w:t xml:space="preserve"> </w:t>

</xml_diff>

<commit_message>
Allow different locations for different affiliations.
</commit_message>
<xml_diff>
--- a/Author-List.docx
+++ b/Author-List.docx
@@ -108,11 +108,322 @@
         <w:rPr>
           <w:vertAlign w:val="superscript"/>
         </w:rPr>
+        <w:t xml:space="preserve">5</w:t>
+      </w:r>
+      <w:r>
+        <w:t xml:space="preserve">, Tori V. Burt</w:t>
+      </w:r>
+      <w:r>
+        <w:rPr>
+          <w:vertAlign w:val="superscript"/>
+        </w:rPr>
         <w:t xml:space="preserve">6</w:t>
       </w:r>
       <w:r>
-        <w:t xml:space="preserve">, Tori V. Burt</w:t>
-      </w:r>
+        <w:t xml:space="preserve">, Sydney Collins</w:t>
+      </w:r>
+      <w:r>
+        <w:rPr>
+          <w:vertAlign w:val="superscript"/>
+        </w:rPr>
+        <w:t xml:space="preserve">6</w:t>
+      </w:r>
+      <w:r>
+        <w:t xml:space="preserve">, Steven Duffy</w:t>
+      </w:r>
+      <w:r>
+        <w:rPr>
+          <w:vertAlign w:val="superscript"/>
+        </w:rPr>
+        <w:t xml:space="preserve">3,7</w:t>
+      </w:r>
+      <w:r>
+        <w:t xml:space="preserve">, Jolene A. Giacinti</w:t>
+      </w:r>
+      <w:r>
+        <w:rPr>
+          <w:vertAlign w:val="superscript"/>
+        </w:rPr>
+        <w:t xml:space="preserve">1</w:t>
+      </w:r>
+      <w:r>
+        <w:t xml:space="preserve">, Scott Gilliland</w:t>
+      </w:r>
+      <w:r>
+        <w:rPr>
+          <w:vertAlign w:val="superscript"/>
+        </w:rPr>
+        <w:t xml:space="preserve">5</w:t>
+      </w:r>
+      <w:r>
+        <w:t xml:space="preserve">, Jean-François Giroux</w:t>
+      </w:r>
+      <w:r>
+        <w:rPr>
+          <w:vertAlign w:val="superscript"/>
+        </w:rPr>
+        <w:t xml:space="preserve">8,9</w:t>
+      </w:r>
+      <w:r>
+        <w:t xml:space="preserve">, Carina Gjerdrum</w:t>
+      </w:r>
+      <w:r>
+        <w:rPr>
+          <w:vertAlign w:val="superscript"/>
+        </w:rPr>
+        <w:t xml:space="preserve">2</w:t>
+      </w:r>
+      <w:r>
+        <w:t xml:space="preserve">, Magella Guillemette</w:t>
+      </w:r>
+      <w:r>
+        <w:rPr>
+          <w:vertAlign w:val="superscript"/>
+        </w:rPr>
+        <w:t xml:space="preserve">10</w:t>
+      </w:r>
+      <w:r>
+        <w:t xml:space="preserve">, Kathryn E. Hargan</w:t>
+      </w:r>
+      <w:r>
+        <w:rPr>
+          <w:vertAlign w:val="superscript"/>
+        </w:rPr>
+        <w:t xml:space="preserve">11</w:t>
+      </w:r>
+      <w:r>
+        <w:t xml:space="preserve">, Megan Jones</w:t>
+      </w:r>
+      <w:r>
+        <w:rPr>
+          <w:vertAlign w:val="superscript"/>
+        </w:rPr>
+        <w:t xml:space="preserve">12,13</w:t>
+      </w:r>
+      <w:r>
+        <w:t xml:space="preserve">, Andrew Kennedy</w:t>
+      </w:r>
+      <w:r>
+        <w:rPr>
+          <w:vertAlign w:val="superscript"/>
+        </w:rPr>
+        <w:t xml:space="preserve">5</w:t>
+      </w:r>
+      <w:r>
+        <w:t xml:space="preserve">, Stéphane Lair</w:t>
+      </w:r>
+      <w:r>
+        <w:rPr>
+          <w:vertAlign w:val="superscript"/>
+        </w:rPr>
+        <w:t xml:space="preserve">14</w:t>
+      </w:r>
+      <w:r>
+        <w:t xml:space="preserve">, Andrew Lang</w:t>
+      </w:r>
+      <w:r>
+        <w:rPr>
+          <w:vertAlign w:val="superscript"/>
+        </w:rPr>
+        <w:t xml:space="preserve">11</w:t>
+      </w:r>
+      <w:r>
+        <w:t xml:space="preserve">, Christine Lepage</w:t>
+      </w:r>
+      <w:r>
+        <w:rPr>
+          <w:vertAlign w:val="superscript"/>
+        </w:rPr>
+        <w:t xml:space="preserve">4</w:t>
+      </w:r>
+      <w:r>
+        <w:t xml:space="preserve">, Gretchen McPhail</w:t>
+      </w:r>
+      <w:r>
+        <w:rPr>
+          <w:vertAlign w:val="superscript"/>
+        </w:rPr>
+        <w:t xml:space="preserve">6</w:t>
+      </w:r>
+      <w:r>
+        <w:t xml:space="preserve">, William A. Montevecchi</w:t>
+      </w:r>
+      <w:r>
+        <w:rPr>
+          <w:vertAlign w:val="superscript"/>
+        </w:rPr>
+        <w:t xml:space="preserve">6</w:t>
+      </w:r>
+      <w:r>
+        <w:t xml:space="preserve">, Glen J. Parsons</w:t>
+      </w:r>
+      <w:r>
+        <w:rPr>
+          <w:vertAlign w:val="superscript"/>
+        </w:rPr>
+        <w:t xml:space="preserve">15</w:t>
+      </w:r>
+      <w:r>
+        <w:t xml:space="preserve">, Jennifer P. Provencher</w:t>
+      </w:r>
+      <w:r>
+        <w:rPr>
+          <w:vertAlign w:val="superscript"/>
+        </w:rPr>
+        <w:t xml:space="preserve">1</w:t>
+      </w:r>
+      <w:r>
+        <w:t xml:space="preserve">, Ishraq Rahman</w:t>
+      </w:r>
+      <w:r>
+        <w:rPr>
+          <w:vertAlign w:val="superscript"/>
+        </w:rPr>
+        <w:t xml:space="preserve">11</w:t>
+      </w:r>
+      <w:r>
+        <w:t xml:space="preserve">, Gregory J. Robertson</w:t>
+      </w:r>
+      <w:r>
+        <w:rPr>
+          <w:vertAlign w:val="superscript"/>
+        </w:rPr>
+        <w:t xml:space="preserve">16</w:t>
+      </w:r>
+      <w:r>
+        <w:t xml:space="preserve">, Yannick Seyer</w:t>
+      </w:r>
+      <w:r>
+        <w:rPr>
+          <w:vertAlign w:val="superscript"/>
+        </w:rPr>
+        <w:t xml:space="preserve">17,18</w:t>
+      </w:r>
+      <w:r>
+        <w:t xml:space="preserve">, Catherine Soos</w:t>
+      </w:r>
+      <w:r>
+        <w:rPr>
+          <w:vertAlign w:val="superscript"/>
+        </w:rPr>
+        <w:t xml:space="preserve">19</w:t>
+      </w:r>
+      <w:r>
+        <w:t xml:space="preserve">, Christopher R. E. Ward</w:t>
+      </w:r>
+      <w:r>
+        <w:rPr>
+          <w:vertAlign w:val="superscript"/>
+        </w:rPr>
+        <w:t xml:space="preserve">3</w:t>
+      </w:r>
+      <w:r>
+        <w:t xml:space="preserve">, Regina Wells</w:t>
+      </w:r>
+      <w:r>
+        <w:rPr>
+          <w:vertAlign w:val="superscript"/>
+        </w:rPr>
+        <w:t xml:space="preserve">20</w:t>
+      </w:r>
+      <w:r>
+        <w:t xml:space="preserve">, Jordan Wight</w:t>
+      </w:r>
+      <w:r>
+        <w:rPr>
+          <w:vertAlign w:val="superscript"/>
+        </w:rPr>
+        <w:t xml:space="preserve">11</w:t>
+      </w:r>
+    </w:p>
+    <w:p>
+      <w:pPr>
+        <w:pStyle w:val="BodyText"/>
+      </w:pPr>
+      <w:r>
+        <w:rPr>
+          <w:vertAlign w:val="superscript"/>
+        </w:rPr>
+        <w:t xml:space="preserve">1</w:t>
+      </w:r>
+      <w:r>
+        <w:t xml:space="preserve">Environment and Climate Change Canada, Wildlife and Landscape Science Directorate, Ottawa, Ontario, Canada</w:t>
+      </w:r>
+    </w:p>
+    <w:p>
+      <w:pPr>
+        <w:pStyle w:val="BodyText"/>
+      </w:pPr>
+      <w:r>
+        <w:rPr>
+          <w:vertAlign w:val="superscript"/>
+        </w:rPr>
+        <w:t xml:space="preserve">2</w:t>
+      </w:r>
+      <w:r>
+        <w:t xml:space="preserve">Environment and Climate Change Canada, Canadian Wildlife Service, Dartmouth, Nova Scotia, Canada</w:t>
+      </w:r>
+    </w:p>
+    <w:p>
+      <w:pPr>
+        <w:pStyle w:val="BodyText"/>
+      </w:pPr>
+      <w:r>
+        <w:rPr>
+          <w:vertAlign w:val="superscript"/>
+        </w:rPr>
+        <w:t xml:space="preserve">3</w:t>
+      </w:r>
+      <w:r>
+        <w:t xml:space="preserve">Environment and Climate Change Canada, Canadian Wildlife Service, Mount Pearl, Newfoundland and Labrador, Canada</w:t>
+      </w:r>
+    </w:p>
+    <w:p>
+      <w:pPr>
+        <w:pStyle w:val="BodyText"/>
+      </w:pPr>
+      <w:r>
+        <w:rPr>
+          <w:vertAlign w:val="superscript"/>
+        </w:rPr>
+        <w:t xml:space="preserve">4</w:t>
+      </w:r>
+      <w:r>
+        <w:t xml:space="preserve">Environment and Climate Change Canada, Canadian Wildlife Service, Québec, Québec, Canada</w:t>
+      </w:r>
+    </w:p>
+    <w:p>
+      <w:pPr>
+        <w:pStyle w:val="BodyText"/>
+      </w:pPr>
+      <w:r>
+        <w:rPr>
+          <w:vertAlign w:val="superscript"/>
+        </w:rPr>
+        <w:t xml:space="preserve">5</w:t>
+      </w:r>
+      <w:r>
+        <w:t xml:space="preserve">Environment and Climate Change Canada, Canadian Wildlife Service, Sackville, New Brunswick, Canada</w:t>
+      </w:r>
+    </w:p>
+    <w:p>
+      <w:pPr>
+        <w:pStyle w:val="BodyText"/>
+      </w:pPr>
+      <w:r>
+        <w:rPr>
+          <w:vertAlign w:val="superscript"/>
+        </w:rPr>
+        <w:t xml:space="preserve">6</w:t>
+      </w:r>
+      <w:r>
+        <w:t xml:space="preserve">Memorial University of Newfoundland, Department of Psychology, St. John’s, Newfoundland and Labrador, Canada</w:t>
+      </w:r>
+    </w:p>
+    <w:p>
+      <w:pPr>
+        <w:pStyle w:val="BodyText"/>
+      </w:pPr>
       <w:r>
         <w:rPr>
           <w:vertAlign w:val="superscript"/>
@@ -120,17 +431,13 @@
         <w:t xml:space="preserve">7</w:t>
       </w:r>
       <w:r>
-        <w:t xml:space="preserve">, Sydney Collins</w:t>
-      </w:r>
-      <w:r>
-        <w:rPr>
-          <w:vertAlign w:val="superscript"/>
-        </w:rPr>
-        <w:t xml:space="preserve">7</w:t>
-      </w:r>
-      <w:r>
-        <w:t xml:space="preserve">, Steven Duffy</w:t>
-      </w:r>
+        <w:t xml:space="preserve">Fisheries and Oceans Canada, Mount Pearl, Newfoundland and Labrador, Canada</w:t>
+      </w:r>
+    </w:p>
+    <w:p>
+      <w:pPr>
+        <w:pStyle w:val="BodyText"/>
+      </w:pPr>
       <w:r>
         <w:rPr>
           <w:vertAlign w:val="superscript"/>
@@ -138,8 +445,13 @@
         <w:t xml:space="preserve">8</w:t>
       </w:r>
       <w:r>
-        <w:t xml:space="preserve">, Jolene A. Giacinti</w:t>
-      </w:r>
+        <w:t xml:space="preserve">Département des Sciences Biologiques, Université du Québec à Montréal, Montréal, Québec, Canada</w:t>
+      </w:r>
+    </w:p>
+    <w:p>
+      <w:pPr>
+        <w:pStyle w:val="BodyText"/>
+      </w:pPr>
       <w:r>
         <w:rPr>
           <w:vertAlign w:val="superscript"/>
@@ -147,8 +459,13 @@
         <w:t xml:space="preserve">9</w:t>
       </w:r>
       <w:r>
-        <w:t xml:space="preserve">, Scott Gilliland</w:t>
-      </w:r>
+        <w:t xml:space="preserve">Société Duvetnor Ltée, Rivière-du-Loup, Quebec, Canada</w:t>
+      </w:r>
+    </w:p>
+    <w:p>
+      <w:pPr>
+        <w:pStyle w:val="BodyText"/>
+      </w:pPr>
       <w:r>
         <w:rPr>
           <w:vertAlign w:val="superscript"/>
@@ -156,17 +473,41 @@
         <w:t xml:space="preserve">10</w:t>
       </w:r>
       <w:r>
-        <w:t xml:space="preserve">, Jean-François Giroux</w:t>
-      </w:r>
-      <w:r>
-        <w:rPr>
-          <w:vertAlign w:val="superscript"/>
-        </w:rPr>
-        <w:t xml:space="preserve">11,12</w:t>
-      </w:r>
-      <w:r>
-        <w:t xml:space="preserve">, Carina Gjerdrum</w:t>
-      </w:r>
+        <w:t xml:space="preserve">Université du Québec à Rimouski, Department of Biology, Chemistry and Geography, Rimouski, Québec, Canada</w:t>
+      </w:r>
+    </w:p>
+    <w:p>
+      <w:pPr>
+        <w:pStyle w:val="BodyText"/>
+      </w:pPr>
+      <w:r>
+        <w:rPr>
+          <w:vertAlign w:val="superscript"/>
+        </w:rPr>
+        <w:t xml:space="preserve">11</w:t>
+      </w:r>
+      <w:r>
+        <w:t xml:space="preserve">Memorial University of Newfoundland, Department of Biology, St. John’s, Newfoundland and Labrador, Canada</w:t>
+      </w:r>
+    </w:p>
+    <w:p>
+      <w:pPr>
+        <w:pStyle w:val="BodyText"/>
+      </w:pPr>
+      <w:r>
+        <w:rPr>
+          <w:vertAlign w:val="superscript"/>
+        </w:rPr>
+        <w:t xml:space="preserve">12</w:t>
+      </w:r>
+      <w:r>
+        <w:t xml:space="preserve">University of Prince Edward Island, Department of Pathology and Microbiology, Charlottetown, Prince Edward Island, Canada</w:t>
+      </w:r>
+    </w:p>
+    <w:p>
+      <w:pPr>
+        <w:pStyle w:val="BodyText"/>
+      </w:pPr>
       <w:r>
         <w:rPr>
           <w:vertAlign w:val="superscript"/>
@@ -174,8 +515,13 @@
         <w:t xml:space="preserve">13</w:t>
       </w:r>
       <w:r>
-        <w:t xml:space="preserve">, Magella Guillemette</w:t>
-      </w:r>
+        <w:t xml:space="preserve">Canadian Wildlife Health Cooperative, Charlottetown, Prince Edward Island, Canada</w:t>
+      </w:r>
+    </w:p>
+    <w:p>
+      <w:pPr>
+        <w:pStyle w:val="BodyText"/>
+      </w:pPr>
       <w:r>
         <w:rPr>
           <w:vertAlign w:val="superscript"/>
@@ -183,8 +529,13 @@
         <w:t xml:space="preserve">14</w:t>
       </w:r>
       <w:r>
-        <w:t xml:space="preserve">, Kathryn E. Hargan</w:t>
-      </w:r>
+        <w:t xml:space="preserve">Université de Montréal, Faculté de médecine vétérinaire, Canadian Wildlife Health Cooperative, Centre québécois sur la santé des animaux sauvages, Montréal, Québec, Canada</w:t>
+      </w:r>
+    </w:p>
+    <w:p>
+      <w:pPr>
+        <w:pStyle w:val="BodyText"/>
+      </w:pPr>
       <w:r>
         <w:rPr>
           <w:vertAlign w:val="superscript"/>
@@ -192,17 +543,41 @@
         <w:t xml:space="preserve">15</w:t>
       </w:r>
       <w:r>
-        <w:t xml:space="preserve">, Megan Jones</w:t>
-      </w:r>
-      <w:r>
-        <w:rPr>
-          <w:vertAlign w:val="superscript"/>
-        </w:rPr>
-        <w:t xml:space="preserve">16,17</w:t>
-      </w:r>
-      <w:r>
-        <w:t xml:space="preserve">, Andrew Kennedy</w:t>
-      </w:r>
+        <w:t xml:space="preserve">Department of Natural Resources and Renewables, Halifax, Nova Scotia, Canada</w:t>
+      </w:r>
+    </w:p>
+    <w:p>
+      <w:pPr>
+        <w:pStyle w:val="BodyText"/>
+      </w:pPr>
+      <w:r>
+        <w:rPr>
+          <w:vertAlign w:val="superscript"/>
+        </w:rPr>
+        <w:t xml:space="preserve">16</w:t>
+      </w:r>
+      <w:r>
+        <w:t xml:space="preserve">Environment and Climate Change Canada, Wildlife and Landscape Science Directorate, Mount Pearl, Newfoundland and Labrador, Canada</w:t>
+      </w:r>
+    </w:p>
+    <w:p>
+      <w:pPr>
+        <w:pStyle w:val="BodyText"/>
+      </w:pPr>
+      <w:r>
+        <w:rPr>
+          <w:vertAlign w:val="superscript"/>
+        </w:rPr>
+        <w:t xml:space="preserve">17</w:t>
+      </w:r>
+      <w:r>
+        <w:t xml:space="preserve">Université du Québec à Rimouski, Department of Biology, Chemistry and Geography, Québec, Québec, Canada</w:t>
+      </w:r>
+    </w:p>
+    <w:p>
+      <w:pPr>
+        <w:pStyle w:val="BodyText"/>
+      </w:pPr>
       <w:r>
         <w:rPr>
           <w:vertAlign w:val="superscript"/>
@@ -210,8 +585,13 @@
         <w:t xml:space="preserve">18</w:t>
       </w:r>
       <w:r>
-        <w:t xml:space="preserve">, Stéphane Lair</w:t>
-      </w:r>
+        <w:t xml:space="preserve">Environment and Climate Change Canada, Canadian Wildlife Service, Québec, Quebec, Canada</w:t>
+      </w:r>
+    </w:p>
+    <w:p>
+      <w:pPr>
+        <w:pStyle w:val="BodyText"/>
+      </w:pPr>
       <w:r>
         <w:rPr>
           <w:vertAlign w:val="superscript"/>
@@ -219,454 +599,18 @@
         <w:t xml:space="preserve">19</w:t>
       </w:r>
       <w:r>
-        <w:t xml:space="preserve">, Andrew Lang</w:t>
-      </w:r>
-      <w:r>
-        <w:rPr>
-          <w:vertAlign w:val="superscript"/>
-        </w:rPr>
-        <w:t xml:space="preserve">15</w:t>
-      </w:r>
-      <w:r>
-        <w:t xml:space="preserve">, Christine Lepage</w:t>
-      </w:r>
-      <w:r>
-        <w:rPr>
-          <w:vertAlign w:val="superscript"/>
-        </w:rPr>
-        <w:t xml:space="preserve">4</w:t>
-      </w:r>
-      <w:r>
-        <w:t xml:space="preserve">, Gretchen McPhail</w:t>
-      </w:r>
-      <w:r>
-        <w:rPr>
-          <w:vertAlign w:val="superscript"/>
-        </w:rPr>
-        <w:t xml:space="preserve">7</w:t>
-      </w:r>
-      <w:r>
-        <w:t xml:space="preserve">, William A. Montevecchi</w:t>
-      </w:r>
-      <w:r>
-        <w:rPr>
-          <w:vertAlign w:val="superscript"/>
-        </w:rPr>
-        <w:t xml:space="preserve">7</w:t>
-      </w:r>
-      <w:r>
-        <w:t xml:space="preserve">, Glen J. Parsons</w:t>
-      </w:r>
+        <w:t xml:space="preserve">Environment and Climate Change Canada, Wildlife and Landscape Science Directorate, Saskatoon, Saskatchewan, Canada</w:t>
+      </w:r>
+    </w:p>
+    <w:p>
+      <w:pPr>
+        <w:pStyle w:val="BodyText"/>
+      </w:pPr>
       <w:r>
         <w:rPr>
           <w:vertAlign w:val="superscript"/>
         </w:rPr>
         <w:t xml:space="preserve">20</w:t>
-      </w:r>
-      <w:r>
-        <w:t xml:space="preserve">, Jennifer P. Provencher</w:t>
-      </w:r>
-      <w:r>
-        <w:rPr>
-          <w:vertAlign w:val="superscript"/>
-        </w:rPr>
-        <w:t xml:space="preserve">1</w:t>
-      </w:r>
-      <w:r>
-        <w:t xml:space="preserve">, Ishraq Rahman</w:t>
-      </w:r>
-      <w:r>
-        <w:rPr>
-          <w:vertAlign w:val="superscript"/>
-        </w:rPr>
-        <w:t xml:space="preserve">15</w:t>
-      </w:r>
-      <w:r>
-        <w:t xml:space="preserve">, Gregory J. Robertson</w:t>
-      </w:r>
-      <w:r>
-        <w:rPr>
-          <w:vertAlign w:val="superscript"/>
-        </w:rPr>
-        <w:t xml:space="preserve">21</w:t>
-      </w:r>
-      <w:r>
-        <w:t xml:space="preserve">, Yannick Seyer</w:t>
-      </w:r>
-      <w:r>
-        <w:rPr>
-          <w:vertAlign w:val="superscript"/>
-        </w:rPr>
-        <w:t xml:space="preserve">4,22</w:t>
-      </w:r>
-      <w:r>
-        <w:t xml:space="preserve">, Catherine Soos</w:t>
-      </w:r>
-      <w:r>
-        <w:rPr>
-          <w:vertAlign w:val="superscript"/>
-        </w:rPr>
-        <w:t xml:space="preserve">23</w:t>
-      </w:r>
-      <w:r>
-        <w:t xml:space="preserve">, Christopher R. E. Ward</w:t>
-      </w:r>
-      <w:r>
-        <w:rPr>
-          <w:vertAlign w:val="superscript"/>
-        </w:rPr>
-        <w:t xml:space="preserve">3</w:t>
-      </w:r>
-      <w:r>
-        <w:t xml:space="preserve">, Regina Wells</w:t>
-      </w:r>
-      <w:r>
-        <w:rPr>
-          <w:vertAlign w:val="superscript"/>
-        </w:rPr>
-        <w:t xml:space="preserve">24</w:t>
-      </w:r>
-      <w:r>
-        <w:t xml:space="preserve">, Jordan Wight</w:t>
-      </w:r>
-      <w:r>
-        <w:rPr>
-          <w:vertAlign w:val="superscript"/>
-        </w:rPr>
-        <w:t xml:space="preserve">15</w:t>
-      </w:r>
-    </w:p>
-    <w:p>
-      <w:pPr>
-        <w:pStyle w:val="BodyText"/>
-      </w:pPr>
-      <w:r>
-        <w:rPr>
-          <w:vertAlign w:val="superscript"/>
-        </w:rPr>
-        <w:t xml:space="preserve">1</w:t>
-      </w:r>
-      <w:r>
-        <w:t xml:space="preserve">Environment and Climate Change Canada, Wildlife and Landscape Science Directorate, Ottawa, Ontario, Canada</w:t>
-      </w:r>
-    </w:p>
-    <w:p>
-      <w:pPr>
-        <w:pStyle w:val="BodyText"/>
-      </w:pPr>
-      <w:r>
-        <w:rPr>
-          <w:vertAlign w:val="superscript"/>
-        </w:rPr>
-        <w:t xml:space="preserve">2</w:t>
-      </w:r>
-      <w:r>
-        <w:t xml:space="preserve">Environment and Climate Change Canada, Canadian Wildlife Service, Dartmouth, Nova Scotia, Canada</w:t>
-      </w:r>
-    </w:p>
-    <w:p>
-      <w:pPr>
-        <w:pStyle w:val="BodyText"/>
-      </w:pPr>
-      <w:r>
-        <w:rPr>
-          <w:vertAlign w:val="superscript"/>
-        </w:rPr>
-        <w:t xml:space="preserve">3</w:t>
-      </w:r>
-      <w:r>
-        <w:t xml:space="preserve">Environment and Climate Change Canada, Canadian Wildlife Service, Mount Pearl, Newfoundland and Labrador, Canada</w:t>
-      </w:r>
-    </w:p>
-    <w:p>
-      <w:pPr>
-        <w:pStyle w:val="BodyText"/>
-      </w:pPr>
-      <w:r>
-        <w:rPr>
-          <w:vertAlign w:val="superscript"/>
-        </w:rPr>
-        <w:t xml:space="preserve">4</w:t>
-      </w:r>
-      <w:r>
-        <w:t xml:space="preserve">Environment and Climate Change Canada, Canadian Wildlife Service, Québec, Québec, Canada</w:t>
-      </w:r>
-    </w:p>
-    <w:p>
-      <w:pPr>
-        <w:pStyle w:val="BodyText"/>
-      </w:pPr>
-      <w:r>
-        <w:rPr>
-          <w:vertAlign w:val="superscript"/>
-        </w:rPr>
-        <w:t xml:space="preserve">5</w:t>
-      </w:r>
-      <w:r>
-        <w:t xml:space="preserve">Environment and Climate Change Canada, Canadian Wildlife Service, Saint John, New Brunswick, Canada</w:t>
-      </w:r>
-    </w:p>
-    <w:p>
-      <w:pPr>
-        <w:pStyle w:val="BodyText"/>
-      </w:pPr>
-      <w:r>
-        <w:rPr>
-          <w:vertAlign w:val="superscript"/>
-        </w:rPr>
-        <w:t xml:space="preserve">6</w:t>
-      </w:r>
-      <w:r>
-        <w:t xml:space="preserve">Environment and Climate Change Canada, Canadian Wildlife Service, Toronto, Ontario, Canada</w:t>
-      </w:r>
-    </w:p>
-    <w:p>
-      <w:pPr>
-        <w:pStyle w:val="BodyText"/>
-      </w:pPr>
-      <w:r>
-        <w:rPr>
-          <w:vertAlign w:val="superscript"/>
-        </w:rPr>
-        <w:t xml:space="preserve">7</w:t>
-      </w:r>
-      <w:r>
-        <w:t xml:space="preserve">Memorial University of Newfoundland, Department of Psychology, St. John’s, Newfoundland and Labrador, Canada</w:t>
-      </w:r>
-    </w:p>
-    <w:p>
-      <w:pPr>
-        <w:pStyle w:val="BodyText"/>
-      </w:pPr>
-      <w:r>
-        <w:rPr>
-          <w:vertAlign w:val="superscript"/>
-        </w:rPr>
-        <w:t xml:space="preserve">8</w:t>
-      </w:r>
-      <w:r>
-        <w:t xml:space="preserve">Fisheries and Oceans Canada, St. John’s, Newfoundland and Labrador, Canada</w:t>
-      </w:r>
-    </w:p>
-    <w:p>
-      <w:pPr>
-        <w:pStyle w:val="BodyText"/>
-      </w:pPr>
-      <w:r>
-        <w:rPr>
-          <w:vertAlign w:val="superscript"/>
-        </w:rPr>
-        <w:t xml:space="preserve">9</w:t>
-      </w:r>
-      <w:r>
-        <w:t xml:space="preserve">Environment and Climate Change Canada, Wildlife and Landscape Science Directorate, Hamilton, Ontario, Canada</w:t>
-      </w:r>
-    </w:p>
-    <w:p>
-      <w:pPr>
-        <w:pStyle w:val="BodyText"/>
-      </w:pPr>
-      <w:r>
-        <w:rPr>
-          <w:vertAlign w:val="superscript"/>
-        </w:rPr>
-        <w:t xml:space="preserve">10</w:t>
-      </w:r>
-      <w:r>
-        <w:t xml:space="preserve">Environment and Climate Change Canada, Canadian Wildlife Service, St. John’s, Newfoundland and Labrador, Canada</w:t>
-      </w:r>
-    </w:p>
-    <w:p>
-      <w:pPr>
-        <w:pStyle w:val="BodyText"/>
-      </w:pPr>
-      <w:r>
-        <w:rPr>
-          <w:vertAlign w:val="superscript"/>
-        </w:rPr>
-        <w:t xml:space="preserve">11</w:t>
-      </w:r>
-      <w:r>
-        <w:t xml:space="preserve">Département des Sciences Biologiques, Université du Québec à Montréal, Montréal, Québec, Canada</w:t>
-      </w:r>
-    </w:p>
-    <w:p>
-      <w:pPr>
-        <w:pStyle w:val="BodyText"/>
-      </w:pPr>
-      <w:r>
-        <w:rPr>
-          <w:vertAlign w:val="superscript"/>
-        </w:rPr>
-        <w:t xml:space="preserve">12</w:t>
-      </w:r>
-      <w:r>
-        <w:t xml:space="preserve">Société Duvetnor Ltée, Montréal, Québec, Canada</w:t>
-      </w:r>
-    </w:p>
-    <w:p>
-      <w:pPr>
-        <w:pStyle w:val="BodyText"/>
-      </w:pPr>
-      <w:r>
-        <w:rPr>
-          <w:vertAlign w:val="superscript"/>
-        </w:rPr>
-        <w:t xml:space="preserve">13</w:t>
-      </w:r>
-      <w:r>
-        <w:t xml:space="preserve">Environment and Climate Change Canada, Canadian Wildlife Service, Halifax, Nova Scotia, Canada</w:t>
-      </w:r>
-    </w:p>
-    <w:p>
-      <w:pPr>
-        <w:pStyle w:val="BodyText"/>
-      </w:pPr>
-      <w:r>
-        <w:rPr>
-          <w:vertAlign w:val="superscript"/>
-        </w:rPr>
-        <w:t xml:space="preserve">14</w:t>
-      </w:r>
-      <w:r>
-        <w:t xml:space="preserve">Université du Québec à Rimouski, Department of Biology, Chemistry and Geography, Rimouski, Québec, Canada</w:t>
-      </w:r>
-    </w:p>
-    <w:p>
-      <w:pPr>
-        <w:pStyle w:val="BodyText"/>
-      </w:pPr>
-      <w:r>
-        <w:rPr>
-          <w:vertAlign w:val="superscript"/>
-        </w:rPr>
-        <w:t xml:space="preserve">15</w:t>
-      </w:r>
-      <w:r>
-        <w:t xml:space="preserve">Memorial University of Newfoundland, Department of Biology, St. John’s, Newfoundland and Labrador, Canada</w:t>
-      </w:r>
-    </w:p>
-    <w:p>
-      <w:pPr>
-        <w:pStyle w:val="BodyText"/>
-      </w:pPr>
-      <w:r>
-        <w:rPr>
-          <w:vertAlign w:val="superscript"/>
-        </w:rPr>
-        <w:t xml:space="preserve">16</w:t>
-      </w:r>
-      <w:r>
-        <w:t xml:space="preserve">University of Prince Edward Island, Department of Pathology and Microbiology, Charlottetown, Prince Edward Island, Canada</w:t>
-      </w:r>
-    </w:p>
-    <w:p>
-      <w:pPr>
-        <w:pStyle w:val="BodyText"/>
-      </w:pPr>
-      <w:r>
-        <w:rPr>
-          <w:vertAlign w:val="superscript"/>
-        </w:rPr>
-        <w:t xml:space="preserve">17</w:t>
-      </w:r>
-      <w:r>
-        <w:t xml:space="preserve">Canadian Wildlife Health Cooperative, Charlottetown, Prince Edward Island, Canada</w:t>
-      </w:r>
-    </w:p>
-    <w:p>
-      <w:pPr>
-        <w:pStyle w:val="BodyText"/>
-      </w:pPr>
-      <w:r>
-        <w:rPr>
-          <w:vertAlign w:val="superscript"/>
-        </w:rPr>
-        <w:t xml:space="preserve">18</w:t>
-      </w:r>
-      <w:r>
-        <w:t xml:space="preserve">Environment and Climate Change Canada, Canadian Wildlife Service, Sackville, New Brunswick, Canada</w:t>
-      </w:r>
-    </w:p>
-    <w:p>
-      <w:pPr>
-        <w:pStyle w:val="BodyText"/>
-      </w:pPr>
-      <w:r>
-        <w:rPr>
-          <w:vertAlign w:val="superscript"/>
-        </w:rPr>
-        <w:t xml:space="preserve">19</w:t>
-      </w:r>
-      <w:r>
-        <w:t xml:space="preserve">Université de Montréal, Faculté de médecine vétérinaire, Canadian Wildlife Health Cooperative, Centre québécois sur la santé des animaux sauvages, Montréal, Québec, Canada</w:t>
-      </w:r>
-    </w:p>
-    <w:p>
-      <w:pPr>
-        <w:pStyle w:val="BodyText"/>
-      </w:pPr>
-      <w:r>
-        <w:rPr>
-          <w:vertAlign w:val="superscript"/>
-        </w:rPr>
-        <w:t xml:space="preserve">20</w:t>
-      </w:r>
-      <w:r>
-        <w:t xml:space="preserve">Department of Natural Resources and Renewables, Halifax, Nova Scotia, Canada</w:t>
-      </w:r>
-    </w:p>
-    <w:p>
-      <w:pPr>
-        <w:pStyle w:val="BodyText"/>
-      </w:pPr>
-      <w:r>
-        <w:rPr>
-          <w:vertAlign w:val="superscript"/>
-        </w:rPr>
-        <w:t xml:space="preserve">21</w:t>
-      </w:r>
-      <w:r>
-        <w:t xml:space="preserve">Environment and Climate Change Canada, Wildlife and Landscape Science Directorate, Mount Pearl, Newfoundland and Labrador, Canada</w:t>
-      </w:r>
-    </w:p>
-    <w:p>
-      <w:pPr>
-        <w:pStyle w:val="BodyText"/>
-      </w:pPr>
-      <w:r>
-        <w:rPr>
-          <w:vertAlign w:val="superscript"/>
-        </w:rPr>
-        <w:t xml:space="preserve">22</w:t>
-      </w:r>
-      <w:r>
-        <w:t xml:space="preserve">Université du Québec à Rimouski, Department of Biology, Chemistry and Geography, Québec, Québec, Canada</w:t>
-      </w:r>
-    </w:p>
-    <w:p>
-      <w:pPr>
-        <w:pStyle w:val="BodyText"/>
-      </w:pPr>
-      <w:r>
-        <w:rPr>
-          <w:vertAlign w:val="superscript"/>
-        </w:rPr>
-        <w:t xml:space="preserve">23</w:t>
-      </w:r>
-      <w:r>
-        <w:t xml:space="preserve">Environment and Climate Change Canada, Wildlife and Landscape Science Directorate, Saskatoon, Saskatchewan, Canada</w:t>
-      </w:r>
-    </w:p>
-    <w:p>
-      <w:pPr>
-        <w:pStyle w:val="BodyText"/>
-      </w:pPr>
-      <w:r>
-        <w:rPr>
-          <w:vertAlign w:val="superscript"/>
-        </w:rPr>
-        <w:t xml:space="preserve">24</w:t>
       </w:r>
       <w:r>
         <w:t xml:space="preserve">Environment and Climate Change Canada, Canadian Wildlife Service, Happy-Valley Goose Bay, Newfoundland and Labrador, Canada</w:t>
@@ -705,7 +649,7 @@
         <w:t xml:space="preserve"> </w:t>
       </w:r>
       <w:r>
-        <w:t xml:space="preserve">Conceptualization, Formal analysis, Funding acquisition, Investigation, Methodology, Project administration, Resources, Software, Supervision, Visualization, Writing - original draft, Writing - review &amp; editing.</w:t>
+        <w:t xml:space="preserve">Conceptualization, Data curation, Formal analysis, Funding acquisition, Investigation, Methodology, Project administration, Resources, Software, Supervision, Visualization, Writing - original draft, Writing - review &amp; editing.</w:t>
       </w:r>
       <w:r>
         <w:t xml:space="preserve"> </w:t>
@@ -737,6 +681,182 @@
         <w:t xml:space="preserve"> </w:t>
       </w:r>
       <w:r>
+        <w:t xml:space="preserve">Conceptualization, Data curation, Investigation, Methodology, Writing - review &amp; editing.</w:t>
+      </w:r>
+      <w:r>
+        <w:t xml:space="preserve"> </w:t>
+      </w:r>
+      <w:r>
+        <w:rPr>
+          <w:bCs/>
+          <w:b/>
+        </w:rPr>
+        <w:t xml:space="preserve">Robert Ronconi:</w:t>
+      </w:r>
+      <w:r>
+        <w:t xml:space="preserve"> </w:t>
+      </w:r>
+      <w:r>
+        <w:t xml:space="preserve">Conceptualization, Investigation, Methodology, Writing - review &amp; editing.</w:t>
+      </w:r>
+      <w:r>
+        <w:t xml:space="preserve"> </w:t>
+      </w:r>
+      <w:r>
+        <w:rPr>
+          <w:bCs/>
+          <w:b/>
+        </w:rPr>
+        <w:t xml:space="preserve">Sabina I. Wilhelm:</w:t>
+      </w:r>
+      <w:r>
+        <w:t xml:space="preserve"> </w:t>
+      </w:r>
+      <w:r>
+        <w:t xml:space="preserve">Conceptualization, Investigation, Methodology, Writing - review &amp; editing.</w:t>
+      </w:r>
+      <w:r>
+        <w:t xml:space="preserve"> </w:t>
+      </w:r>
+      <w:r>
+        <w:rPr>
+          <w:bCs/>
+          <w:b/>
+        </w:rPr>
+        <w:t xml:space="preserve">Jean-François Rail:</w:t>
+      </w:r>
+      <w:r>
+        <w:t xml:space="preserve"> </w:t>
+      </w:r>
+      <w:r>
+        <w:t xml:space="preserve">Conceptualization, Investigation, Methodology, Writing - review &amp; editing.</w:t>
+      </w:r>
+      <w:r>
+        <w:t xml:space="preserve"> </w:t>
+      </w:r>
+      <w:r>
+        <w:rPr>
+          <w:bCs/>
+          <w:b/>
+        </w:rPr>
+        <w:t xml:space="preserve">Tabatha Cormier:</w:t>
+      </w:r>
+      <w:r>
+        <w:t xml:space="preserve"> </w:t>
+      </w:r>
+      <w:r>
+        <w:t xml:space="preserve">Data curation, Investigation, Methodology, Writing - review &amp; editing.</w:t>
+      </w:r>
+      <w:r>
+        <w:t xml:space="preserve"> </w:t>
+      </w:r>
+      <w:r>
+        <w:rPr>
+          <w:bCs/>
+          <w:b/>
+        </w:rPr>
+        <w:t xml:space="preserve">Matthieu Beaumont:</w:t>
+      </w:r>
+      <w:r>
+        <w:t xml:space="preserve"> </w:t>
+      </w:r>
+      <w:r>
+        <w:t xml:space="preserve">Conceptualization, Investigation, Methodology.</w:t>
+      </w:r>
+      <w:r>
+        <w:t xml:space="preserve"> </w:t>
+      </w:r>
+      <w:r>
+        <w:rPr>
+          <w:bCs/>
+          <w:b/>
+        </w:rPr>
+        <w:t xml:space="preserve">Campbell Bowser:</w:t>
+      </w:r>
+      <w:r>
+        <w:t xml:space="preserve"> </w:t>
+      </w:r>
+      <w:r>
+        <w:t xml:space="preserve">Investigation, Methodology, Software, Validation, Visualization, Writing - review &amp; editing.</w:t>
+      </w:r>
+      <w:r>
+        <w:t xml:space="preserve"> </w:t>
+      </w:r>
+      <w:r>
+        <w:rPr>
+          <w:bCs/>
+          <w:b/>
+        </w:rPr>
+        <w:t xml:space="preserve">Tori V. Burt:</w:t>
+      </w:r>
+      <w:r>
+        <w:t xml:space="preserve"> </w:t>
+      </w:r>
+      <w:r>
+        <w:t xml:space="preserve">Conceptualization, Data curation, Investigation, Methodology, Writing - review &amp; editing.</w:t>
+      </w:r>
+      <w:r>
+        <w:t xml:space="preserve"> </w:t>
+      </w:r>
+      <w:r>
+        <w:rPr>
+          <w:bCs/>
+          <w:b/>
+        </w:rPr>
+        <w:t xml:space="preserve">Sydney Collins:</w:t>
+      </w:r>
+      <w:r>
+        <w:t xml:space="preserve"> </w:t>
+      </w:r>
+      <w:r>
+        <w:t xml:space="preserve">Conceptualization, Data curation, Investigation, Methodology, Writing - review &amp; editing.</w:t>
+      </w:r>
+      <w:r>
+        <w:t xml:space="preserve"> </w:t>
+      </w:r>
+      <w:r>
+        <w:rPr>
+          <w:bCs/>
+          <w:b/>
+        </w:rPr>
+        <w:t xml:space="preserve">Steven Duffy:</w:t>
+      </w:r>
+      <w:r>
+        <w:t xml:space="preserve"> </w:t>
+      </w:r>
+      <w:r>
+        <w:t xml:space="preserve">Investigation, Methodology.</w:t>
+      </w:r>
+      <w:r>
+        <w:t xml:space="preserve"> </w:t>
+      </w:r>
+      <w:r>
+        <w:rPr>
+          <w:bCs/>
+          <w:b/>
+        </w:rPr>
+        <w:t xml:space="preserve">Jolene A. Giacinti:</w:t>
+      </w:r>
+      <w:r>
+        <w:t xml:space="preserve"> </w:t>
+      </w:r>
+      <w:r>
+        <w:t xml:space="preserve">Conceptualization, Data curation, Investigation, Methodology, Writing - review &amp; editing.</w:t>
+      </w:r>
+      <w:r>
+        <w:t xml:space="preserve"> </w:t>
+      </w:r>
+      <w:r>
+        <w:rPr>
+          <w:bCs/>
+          <w:b/>
+        </w:rPr>
+        <w:t xml:space="preserve">Scott Gilliland:</w:t>
+      </w:r>
+      <w:r>
+        <w:t xml:space="preserve"> </w:t>
+      </w:r>
+      <w:r>
         <w:t xml:space="preserve">Investigation, Methodology, Writing - review &amp; editing.</w:t>
       </w:r>
       <w:r>
@@ -747,7 +867,87 @@
           <w:bCs/>
           <w:b/>
         </w:rPr>
-        <w:t xml:space="preserve">Robert Ronconi:</w:t>
+        <w:t xml:space="preserve">Jean-François Giroux:</w:t>
+      </w:r>
+      <w:r>
+        <w:t xml:space="preserve"> </w:t>
+      </w:r>
+      <w:r>
+        <w:t xml:space="preserve">Conceptualization, Investigation, Methodology, Supervision, Writing - review &amp; editing.</w:t>
+      </w:r>
+      <w:r>
+        <w:t xml:space="preserve"> </w:t>
+      </w:r>
+      <w:r>
+        <w:rPr>
+          <w:bCs/>
+          <w:b/>
+        </w:rPr>
+        <w:t xml:space="preserve">Carina Gjerdrum:</w:t>
+      </w:r>
+      <w:r>
+        <w:t xml:space="preserve"> </w:t>
+      </w:r>
+      <w:r>
+        <w:t xml:space="preserve">Conceptualization, Investigation, Methodology, Writing - review &amp; editing.</w:t>
+      </w:r>
+      <w:r>
+        <w:t xml:space="preserve"> </w:t>
+      </w:r>
+      <w:r>
+        <w:rPr>
+          <w:bCs/>
+          <w:b/>
+        </w:rPr>
+        <w:t xml:space="preserve">Magella Guillemette:</w:t>
+      </w:r>
+      <w:r>
+        <w:t xml:space="preserve"> </w:t>
+      </w:r>
+      <w:r>
+        <w:t xml:space="preserve">Investigation, Methodology, Supervision.</w:t>
+      </w:r>
+      <w:r>
+        <w:t xml:space="preserve"> </w:t>
+      </w:r>
+      <w:r>
+        <w:rPr>
+          <w:bCs/>
+          <w:b/>
+        </w:rPr>
+        <w:t xml:space="preserve">Kathryn E. Hargan:</w:t>
+      </w:r>
+      <w:r>
+        <w:t xml:space="preserve"> </w:t>
+      </w:r>
+      <w:r>
+        <w:t xml:space="preserve">Investigation, Methodology, Supervision.</w:t>
+      </w:r>
+      <w:r>
+        <w:t xml:space="preserve"> </w:t>
+      </w:r>
+      <w:r>
+        <w:rPr>
+          <w:bCs/>
+          <w:b/>
+        </w:rPr>
+        <w:t xml:space="preserve">Megan Jones:</w:t>
+      </w:r>
+      <w:r>
+        <w:t xml:space="preserve"> </w:t>
+      </w:r>
+      <w:r>
+        <w:t xml:space="preserve">Conceptualization, Data curation, Investigation, Methodology, Supervision.</w:t>
+      </w:r>
+      <w:r>
+        <w:t xml:space="preserve"> </w:t>
+      </w:r>
+      <w:r>
+        <w:rPr>
+          <w:bCs/>
+          <w:b/>
+        </w:rPr>
+        <w:t xml:space="preserve">Andrew Kennedy:</w:t>
       </w:r>
       <w:r>
         <w:t xml:space="preserve"> </w:t>
@@ -763,7 +963,87 @@
           <w:bCs/>
           <w:b/>
         </w:rPr>
-        <w:t xml:space="preserve">Sabina I. Wilhelm:</w:t>
+        <w:t xml:space="preserve">Stéphane Lair:</w:t>
+      </w:r>
+      <w:r>
+        <w:t xml:space="preserve"> </w:t>
+      </w:r>
+      <w:r>
+        <w:t xml:space="preserve">Conceptualization, Data curation, Investigation, Methodology, Supervision, Writing - review &amp; editing.</w:t>
+      </w:r>
+      <w:r>
+        <w:t xml:space="preserve"> </w:t>
+      </w:r>
+      <w:r>
+        <w:rPr>
+          <w:bCs/>
+          <w:b/>
+        </w:rPr>
+        <w:t xml:space="preserve">Andrew Lang:</w:t>
+      </w:r>
+      <w:r>
+        <w:t xml:space="preserve"> </w:t>
+      </w:r>
+      <w:r>
+        <w:t xml:space="preserve">Investigation, Methodology, Supervision, Writing - review &amp; editing.</w:t>
+      </w:r>
+      <w:r>
+        <w:t xml:space="preserve"> </w:t>
+      </w:r>
+      <w:r>
+        <w:rPr>
+          <w:bCs/>
+          <w:b/>
+        </w:rPr>
+        <w:t xml:space="preserve">Christine Lepage:</w:t>
+      </w:r>
+      <w:r>
+        <w:t xml:space="preserve"> </w:t>
+      </w:r>
+      <w:r>
+        <w:t xml:space="preserve">Data curation, Investigation, Methodology, Writing - review &amp; editing.</w:t>
+      </w:r>
+      <w:r>
+        <w:t xml:space="preserve"> </w:t>
+      </w:r>
+      <w:r>
+        <w:rPr>
+          <w:bCs/>
+          <w:b/>
+        </w:rPr>
+        <w:t xml:space="preserve">Gretchen McPhail:</w:t>
+      </w:r>
+      <w:r>
+        <w:t xml:space="preserve"> </w:t>
+      </w:r>
+      <w:r>
+        <w:t xml:space="preserve">Conceptualization, Data curation, Investigation, Methodology, Writing - review &amp; editing.</w:t>
+      </w:r>
+      <w:r>
+        <w:t xml:space="preserve"> </w:t>
+      </w:r>
+      <w:r>
+        <w:rPr>
+          <w:bCs/>
+          <w:b/>
+        </w:rPr>
+        <w:t xml:space="preserve">William A. Montevecchi:</w:t>
+      </w:r>
+      <w:r>
+        <w:t xml:space="preserve"> </w:t>
+      </w:r>
+      <w:r>
+        <w:t xml:space="preserve">Conceptualization, Data curation, Investigation, Methodology, Supervision, Writing - review &amp; editing.</w:t>
+      </w:r>
+      <w:r>
+        <w:t xml:space="preserve"> </w:t>
+      </w:r>
+      <w:r>
+        <w:rPr>
+          <w:bCs/>
+          <w:b/>
+        </w:rPr>
+        <w:t xml:space="preserve">Glen J. Parsons:</w:t>
       </w:r>
       <w:r>
         <w:t xml:space="preserve"> </w:t>
@@ -779,7 +1059,23 @@
           <w:bCs/>
           <w:b/>
         </w:rPr>
-        <w:t xml:space="preserve">Jean-François Rail:</w:t>
+        <w:t xml:space="preserve">Jennifer P. Provencher:</w:t>
+      </w:r>
+      <w:r>
+        <w:t xml:space="preserve"> </w:t>
+      </w:r>
+      <w:r>
+        <w:t xml:space="preserve">Writing - review &amp; editing.</w:t>
+      </w:r>
+      <w:r>
+        <w:t xml:space="preserve"> </w:t>
+      </w:r>
+      <w:r>
+        <w:rPr>
+          <w:bCs/>
+          <w:b/>
+        </w:rPr>
+        <w:t xml:space="preserve">Ishraq Rahman:</w:t>
       </w:r>
       <w:r>
         <w:t xml:space="preserve"> </w:t>
@@ -795,39 +1091,23 @@
           <w:bCs/>
           <w:b/>
         </w:rPr>
-        <w:t xml:space="preserve">Tabatha Cormier:</w:t>
-      </w:r>
-      <w:r>
-        <w:t xml:space="preserve"> </w:t>
-      </w:r>
-      <w:r>
-        <w:t xml:space="preserve">Writing - review &amp; editing.</w:t>
-      </w:r>
-      <w:r>
-        <w:t xml:space="preserve"> </w:t>
-      </w:r>
-      <w:r>
-        <w:rPr>
-          <w:bCs/>
-          <w:b/>
-        </w:rPr>
-        <w:t xml:space="preserve">Campbell Bowser:</w:t>
-      </w:r>
-      <w:r>
-        <w:t xml:space="preserve"> </w:t>
-      </w:r>
-      <w:r>
-        <w:t xml:space="preserve">Investigation, Methodology.</w:t>
-      </w:r>
-      <w:r>
-        <w:t xml:space="preserve"> </w:t>
-      </w:r>
-      <w:r>
-        <w:rPr>
-          <w:bCs/>
-          <w:b/>
-        </w:rPr>
-        <w:t xml:space="preserve">Tori V. Burt:</w:t>
+        <w:t xml:space="preserve">Gregory J. Robertson:</w:t>
+      </w:r>
+      <w:r>
+        <w:t xml:space="preserve"> </w:t>
+      </w:r>
+      <w:r>
+        <w:t xml:space="preserve">Conceptualization, Writing - review &amp; editing.</w:t>
+      </w:r>
+      <w:r>
+        <w:t xml:space="preserve"> </w:t>
+      </w:r>
+      <w:r>
+        <w:rPr>
+          <w:bCs/>
+          <w:b/>
+        </w:rPr>
+        <w:t xml:space="preserve">Yannick Seyer:</w:t>
       </w:r>
       <w:r>
         <w:t xml:space="preserve"> </w:t>
@@ -843,301 +1123,29 @@
           <w:bCs/>
           <w:b/>
         </w:rPr>
-        <w:t xml:space="preserve">Sydney Collins:</w:t>
-      </w:r>
-      <w:r>
-        <w:t xml:space="preserve"> </w:t>
-      </w:r>
-      <w:r>
-        <w:t xml:space="preserve">Data curation, Investigation, Methodology, Writing - review &amp; editing.</w:t>
-      </w:r>
-      <w:r>
-        <w:t xml:space="preserve"> </w:t>
-      </w:r>
-      <w:r>
-        <w:rPr>
-          <w:bCs/>
-          <w:b/>
-        </w:rPr>
-        <w:t xml:space="preserve">Steven Duffy:</w:t>
-      </w:r>
-      <w:r>
-        <w:t xml:space="preserve"> </w:t>
-      </w:r>
-      <w:r>
-        <w:t xml:space="preserve">Investigation, Methodology.</w:t>
-      </w:r>
-      <w:r>
-        <w:t xml:space="preserve"> </w:t>
-      </w:r>
-      <w:r>
-        <w:rPr>
-          <w:bCs/>
-          <w:b/>
-        </w:rPr>
-        <w:t xml:space="preserve">Jolene A. Giacinti:</w:t>
-      </w:r>
-      <w:r>
-        <w:t xml:space="preserve"> </w:t>
-      </w:r>
-      <w:r>
-        <w:t xml:space="preserve">Conceptualization, Data curation, Investigation, Methodology, Writing - review &amp; editing.</w:t>
-      </w:r>
-      <w:r>
-        <w:t xml:space="preserve"> </w:t>
-      </w:r>
-      <w:r>
-        <w:rPr>
-          <w:bCs/>
-          <w:b/>
-        </w:rPr>
-        <w:t xml:space="preserve">Scott Gilliland:</w:t>
-      </w:r>
-      <w:r>
-        <w:t xml:space="preserve"> </w:t>
-      </w:r>
-      <w:r>
-        <w:t xml:space="preserve">Data curation, Investigation, Methodology, Writing - review &amp; editing.</w:t>
-      </w:r>
-      <w:r>
-        <w:t xml:space="preserve"> </w:t>
-      </w:r>
-      <w:r>
-        <w:rPr>
-          <w:bCs/>
-          <w:b/>
-        </w:rPr>
-        <w:t xml:space="preserve">Jean-François Giroux:</w:t>
-      </w:r>
-      <w:r>
-        <w:t xml:space="preserve"> </w:t>
-      </w:r>
-      <w:r>
-        <w:t xml:space="preserve">Data curation, Funding acquisition, Investigation, Methodology, Resources, Writing - review &amp; editing.</w:t>
-      </w:r>
-      <w:r>
-        <w:t xml:space="preserve"> </w:t>
-      </w:r>
-      <w:r>
-        <w:rPr>
-          <w:bCs/>
-          <w:b/>
-        </w:rPr>
-        <w:t xml:space="preserve">Carina Gjerdrum:</w:t>
-      </w:r>
-      <w:r>
-        <w:t xml:space="preserve"> </w:t>
-      </w:r>
-      <w:r>
-        <w:t xml:space="preserve">Data curation, Investigation, Methodology, Writing - review &amp; editing.</w:t>
-      </w:r>
-      <w:r>
-        <w:t xml:space="preserve"> </w:t>
-      </w:r>
-      <w:r>
-        <w:rPr>
-          <w:bCs/>
-          <w:b/>
-        </w:rPr>
-        <w:t xml:space="preserve">Magella Guillemette:</w:t>
-      </w:r>
-      <w:r>
-        <w:t xml:space="preserve"> </w:t>
-      </w:r>
-      <w:r>
-        <w:t xml:space="preserve">Investigation, Methodology.</w:t>
-      </w:r>
-      <w:r>
-        <w:t xml:space="preserve"> </w:t>
-      </w:r>
-      <w:r>
-        <w:rPr>
-          <w:bCs/>
-          <w:b/>
-        </w:rPr>
-        <w:t xml:space="preserve">Kathryn E. Hargan:</w:t>
-      </w:r>
-      <w:r>
-        <w:t xml:space="preserve"> </w:t>
-      </w:r>
-      <w:r>
-        <w:t xml:space="preserve">Investigation, Methodology, Resources, Supervision.</w:t>
-      </w:r>
-      <w:r>
-        <w:t xml:space="preserve"> </w:t>
-      </w:r>
-      <w:r>
-        <w:rPr>
-          <w:bCs/>
-          <w:b/>
-        </w:rPr>
-        <w:t xml:space="preserve">Megan Jones:</w:t>
-      </w:r>
-      <w:r>
-        <w:t xml:space="preserve"> </w:t>
-      </w:r>
-      <w:r>
-        <w:t xml:space="preserve">Investigation, Methodology.</w:t>
-      </w:r>
-      <w:r>
-        <w:t xml:space="preserve"> </w:t>
-      </w:r>
-      <w:r>
-        <w:rPr>
-          <w:bCs/>
-          <w:b/>
-        </w:rPr>
-        <w:t xml:space="preserve">Stéphane Lair:</w:t>
-      </w:r>
-      <w:r>
-        <w:t xml:space="preserve"> </w:t>
-      </w:r>
-      <w:r>
-        <w:t xml:space="preserve">Investigation, Methodology.</w:t>
-      </w:r>
-      <w:r>
-        <w:t xml:space="preserve"> </w:t>
-      </w:r>
-      <w:r>
-        <w:rPr>
-          <w:bCs/>
-          <w:b/>
-        </w:rPr>
-        <w:t xml:space="preserve">Andrew Lang:</w:t>
-      </w:r>
-      <w:r>
-        <w:t xml:space="preserve"> </w:t>
-      </w:r>
-      <w:r>
-        <w:t xml:space="preserve">Investigation, Methodology, Resources, Supervision.</w:t>
-      </w:r>
-      <w:r>
-        <w:t xml:space="preserve"> </w:t>
-      </w:r>
-      <w:r>
-        <w:rPr>
-          <w:bCs/>
-          <w:b/>
-        </w:rPr>
-        <w:t xml:space="preserve">Christine Lepage:</w:t>
-      </w:r>
-      <w:r>
-        <w:t xml:space="preserve"> </w:t>
-      </w:r>
-      <w:r>
-        <w:t xml:space="preserve">Data curation, Investigation, Methodology, Writing - review &amp; editing.</w:t>
-      </w:r>
-      <w:r>
-        <w:t xml:space="preserve"> </w:t>
-      </w:r>
-      <w:r>
-        <w:rPr>
-          <w:bCs/>
-          <w:b/>
-        </w:rPr>
-        <w:t xml:space="preserve">Gretchen McPhail:</w:t>
-      </w:r>
-      <w:r>
-        <w:t xml:space="preserve"> </w:t>
-      </w:r>
-      <w:r>
-        <w:t xml:space="preserve">Data curation, Investigation, Methodology.</w:t>
-      </w:r>
-      <w:r>
-        <w:t xml:space="preserve"> </w:t>
-      </w:r>
-      <w:r>
-        <w:rPr>
-          <w:bCs/>
-          <w:b/>
-        </w:rPr>
-        <w:t xml:space="preserve">William A. Montevecchi:</w:t>
-      </w:r>
-      <w:r>
-        <w:t xml:space="preserve"> </w:t>
-      </w:r>
-      <w:r>
-        <w:t xml:space="preserve">Conceptualization, Data curation, Funding acquisition, Investigation, Methodology, Project administration, Supervision, Writing - review &amp; editing.</w:t>
-      </w:r>
-      <w:r>
-        <w:t xml:space="preserve"> </w:t>
-      </w:r>
-      <w:r>
-        <w:rPr>
-          <w:bCs/>
-          <w:b/>
-        </w:rPr>
-        <w:t xml:space="preserve">Glen J. Parsons:</w:t>
-      </w:r>
-      <w:r>
-        <w:t xml:space="preserve"> </w:t>
-      </w:r>
-      <w:r>
-        <w:t xml:space="preserve">Investigation, Methodology, Writing - review &amp; editing.</w:t>
-      </w:r>
-      <w:r>
-        <w:t xml:space="preserve"> </w:t>
-      </w:r>
-      <w:r>
-        <w:rPr>
-          <w:bCs/>
-          <w:b/>
-        </w:rPr>
-        <w:t xml:space="preserve">Ishraq Rahman:</w:t>
-      </w:r>
-      <w:r>
-        <w:t xml:space="preserve"> </w:t>
-      </w:r>
-      <w:r>
-        <w:t xml:space="preserve">Investigation, Methodology.</w:t>
-      </w:r>
-      <w:r>
-        <w:t xml:space="preserve"> </w:t>
-      </w:r>
-      <w:r>
-        <w:rPr>
-          <w:bCs/>
-          <w:b/>
-        </w:rPr>
-        <w:t xml:space="preserve">Gregory J. Robertson:</w:t>
-      </w:r>
-      <w:r>
-        <w:t xml:space="preserve"> </w:t>
-      </w:r>
-      <w:r>
-        <w:t xml:space="preserve">Conceptualization, Writing - review &amp; editing.</w:t>
-      </w:r>
-      <w:r>
-        <w:t xml:space="preserve"> </w:t>
-      </w:r>
-      <w:r>
-        <w:rPr>
-          <w:bCs/>
-          <w:b/>
-        </w:rPr>
-        <w:t xml:space="preserve">Yannick Seyer:</w:t>
-      </w:r>
-      <w:r>
-        <w:t xml:space="preserve"> </w:t>
-      </w:r>
-      <w:r>
-        <w:t xml:space="preserve">Investigation, Methodology.</w:t>
-      </w:r>
-      <w:r>
-        <w:t xml:space="preserve"> </w:t>
-      </w:r>
-      <w:r>
-        <w:rPr>
-          <w:bCs/>
-          <w:b/>
-        </w:rPr>
         <w:t xml:space="preserve">Christopher R. E. Ward:</w:t>
       </w:r>
       <w:r>
         <w:t xml:space="preserve"> </w:t>
       </w:r>
       <w:r>
-        <w:t xml:space="preserve">Investigation, Methodology, Writing - review &amp; editing.</w:t>
+        <w:t xml:space="preserve">Conceptualization, Investigation, Methodology, Writing - review &amp; editing.</w:t>
+      </w:r>
+      <w:r>
+        <w:t xml:space="preserve"> </w:t>
+      </w:r>
+      <w:r>
+        <w:rPr>
+          <w:bCs/>
+          <w:b/>
+        </w:rPr>
+        <w:t xml:space="preserve">Regina Wells:</w:t>
+      </w:r>
+      <w:r>
+        <w:t xml:space="preserve"> </w:t>
+      </w:r>
+      <w:r>
+        <w:t xml:space="preserve">Conceptualization, Investigation, Methodology.</w:t>
       </w:r>
       <w:r>
         <w:t xml:space="preserve"> </w:t>

</xml_diff>